<commit_message>
Add process flow diagram for time determination in COD fee
</commit_message>
<xml_diff>
--- a/01.WORKING_SPACE/2.TranVietHai-25410198/COD-fee-v2.docx
+++ b/01.WORKING_SPACE/2.TranVietHai-25410198/COD-fee-v2.docx
@@ -33122,6 +33122,63 @@
           <w:szCs w:val="18"/>
         </w:rPr>
       </w:pPr>
+      <w:r>
+        <w:rPr>
+          <w:i/>
+          <w:iCs/>
+          <w:noProof/>
+          <w:sz w:val="18"/>
+          <w:szCs w:val="18"/>
+        </w:rPr>
+        <w:drawing>
+          <wp:inline distT="0" distB="0" distL="0" distR="0" wp14:anchorId="3AC01316" wp14:editId="0CBDA7BF">
+            <wp:extent cx="5727700" cy="836295"/>
+            <wp:effectExtent l="0" t="0" r="6350" b="1905"/>
+            <wp:docPr id="1137267305" name="Picture 3"/>
+            <wp:cNvGraphicFramePr>
+              <a:graphicFrameLocks xmlns:a="http://schemas.openxmlformats.org/drawingml/2006/main" noChangeAspect="1"/>
+            </wp:cNvGraphicFramePr>
+            <a:graphic xmlns:a="http://schemas.openxmlformats.org/drawingml/2006/main">
+              <a:graphicData uri="http://schemas.openxmlformats.org/drawingml/2006/picture">
+                <pic:pic xmlns:pic="http://schemas.openxmlformats.org/drawingml/2006/picture">
+                  <pic:nvPicPr>
+                    <pic:cNvPr id="0" name="Picture 2"/>
+                    <pic:cNvPicPr>
+                      <a:picLocks noChangeAspect="1" noChangeArrowheads="1"/>
+                    </pic:cNvPicPr>
+                  </pic:nvPicPr>
+                  <pic:blipFill>
+                    <a:blip r:embed="rId14" cstate="print">
+                      <a:extLst>
+                        <a:ext uri="{28A0092B-C50C-407E-A947-70E740481C1C}">
+                          <a14:useLocalDpi xmlns:a14="http://schemas.microsoft.com/office/drawing/2010/main" val="0"/>
+                        </a:ext>
+                      </a:extLst>
+                    </a:blip>
+                    <a:srcRect/>
+                    <a:stretch>
+                      <a:fillRect/>
+                    </a:stretch>
+                  </pic:blipFill>
+                  <pic:spPr bwMode="auto">
+                    <a:xfrm>
+                      <a:off x="0" y="0"/>
+                      <a:ext cx="5727700" cy="836295"/>
+                    </a:xfrm>
+                    <a:prstGeom prst="rect">
+                      <a:avLst/>
+                    </a:prstGeom>
+                    <a:noFill/>
+                    <a:ln>
+                      <a:noFill/>
+                    </a:ln>
+                  </pic:spPr>
+                </pic:pic>
+              </a:graphicData>
+            </a:graphic>
+          </wp:inline>
+        </w:drawing>
+      </w:r>
     </w:p>
     <w:p>
       <w:pPr>
@@ -33135,12 +33192,6 @@
         </w:rPr>
         <w:t>Hình (6). Sơ đồ 5 Whys nguyên nhân gốc rễ</w:t>
       </w:r>
-    </w:p>
-    <w:p>
-      <w:pPr>
-        <w:spacing w:after="200"/>
-        <w:jc w:val="center"/>
-      </w:pPr>
     </w:p>
     <w:p>
       <w:pPr>
@@ -33210,11 +33261,11 @@
         <w:jc w:val="both"/>
       </w:pPr>
       <w:r>
-        <w:t xml:space="preserve">Giả định đo lường dựa trên sơ đồ BPMN chuẩn (Bảng 2, 24 bước) và dữ liệu phỏng vấn tại Bảng 8/Bảng 11: tổng thời gian xử lý (PT) kỳ vọng ≈ 111,35 phút (≈1,86 giờ), tổng thời gian chờ (WT) trên nhánh chính = 132 giờ (5 cấu phần, xem Bảng 20). Chu kỳ (CT = PT + WT) ≈ 133,86 giờ ≈ 5,58 ngày — nằm trong khung 5–7 ngày công bố tại PL-02. Hiệu suất chu trình (PCE = PT/CT × 100%) ≈ 1,39%, cho thấy hơn 98% thời gian của quy trình COD là thời gian chờ chứ không phải xử lý thực chất. Tỷ lệ xử lý đúng ngay lần đầu (FTR) = 92% × 95% = 87,4% (xem Bảng 21). Với 12,6% đơn còn lại rơi vào </w:t>
+        <w:t xml:space="preserve">Giả định đo lường dựa trên sơ đồ BPMN chuẩn (Bảng 2, 24 bước) và dữ liệu phỏng vấn tại Bảng 8/Bảng 11: tổng thời gian xử lý (PT) kỳ vọng ≈ 111,35 phút (≈1,86 giờ), tổng thời gian chờ (WT) trên nhánh chính = 132 giờ (5 cấu phần, xem Bảng 20). Chu kỳ (CT = PT + WT) ≈ 133,86 giờ ≈ 5,58 ngày — nằm </w:t>
       </w:r>
       <w:r>
         <w:lastRenderedPageBreak/>
-        <w:t>nhánh ngoại lệ (hoàn hàng ~8% hoặc khiếu nại đối soát ~5%), CT thực tế dài hơn đáng kể (xem 2 dòng cuối Bảng 20).</w:t>
+        <w:t>trong khung 5–7 ngày công bố tại PL-02. Hiệu suất chu trình (PCE = PT/CT × 100%) ≈ 1,39%, cho thấy hơn 98% thời gian của quy trình COD là thời gian chờ chứ không phải xử lý thực chất. Tỷ lệ xử lý đúng ngay lần đầu (FTR) = 92% × 95% = 87,4% (xem Bảng 21). Với 12,6% đơn còn lại rơi vào nhánh ngoại lệ (hoàn hàng ~8% hoặc khiếu nại đối soát ~5%), CT thực tế dài hơn đáng kể (xem 2 dòng cuối Bảng 20).</w:t>
       </w:r>
     </w:p>
     <w:p>
@@ -34764,6 +34815,7 @@
                 <w:sz w:val="18"/>
                 <w:szCs w:val="18"/>
               </w:rPr>
+              <w:lastRenderedPageBreak/>
               <w:t>Tổng WT (nhánh chính, 5 cấu phần, chưa gồm 2 trường hợp ngoại lệ)</w:t>
             </w:r>
           </w:p>
@@ -34888,7 +34940,6 @@
                 <w:sz w:val="18"/>
                 <w:szCs w:val="18"/>
               </w:rPr>
-              <w:lastRenderedPageBreak/>
               <w:t>CT — Cycle Time (nhánh chính) / PCE / FTR</w:t>
             </w:r>
           </w:p>
@@ -34995,6 +35046,4190 @@
       <w:pPr>
         <w:spacing w:after="220"/>
         <w:jc w:val="center"/>
+        <w:rPr>
+          <w:i/>
+          <w:iCs/>
+        </w:rPr>
+      </w:pPr>
+    </w:p>
+    <w:p>
+      <w:pPr>
+        <w:spacing w:after="160"/>
+      </w:pPr>
+      <w:r>
+        <w:rPr>
+          <w:b/>
+          <w:bCs/>
+        </w:rPr>
+        <w:t>Bảng 20.1: Phân tích thời gian chi tiết theo từng bước (Bảng 2)</w:t>
+      </w:r>
+    </w:p>
+    <w:tbl>
+      <w:tblPr>
+        <w:tblStyle w:val="TableGrid"/>
+        <w:tblW w:w="0" w:type="auto"/>
+        <w:tblLook w:val="04A0" w:firstRow="1" w:lastRow="0" w:firstColumn="1" w:lastColumn="0" w:noHBand="0" w:noVBand="1"/>
+      </w:tblPr>
+      <w:tblGrid>
+        <w:gridCol w:w="1009"/>
+        <w:gridCol w:w="1513"/>
+        <w:gridCol w:w="1011"/>
+        <w:gridCol w:w="885"/>
+        <w:gridCol w:w="882"/>
+        <w:gridCol w:w="3716"/>
+      </w:tblGrid>
+      <w:tr>
+        <w:tc>
+          <w:tcPr>
+            <w:tcW w:w="0" w:type="auto"/>
+            <w:shd w:val="clear" w:color="auto" w:fill="DAE9F7" w:themeFill="text2" w:themeFillTint="1A"/>
+            <w:hideMark/>
+          </w:tcPr>
+          <w:p>
+            <w:pPr>
+              <w:spacing w:after="160"/>
+              <w:rPr>
+                <w:b/>
+                <w:bCs/>
+                <w:sz w:val="20"/>
+                <w:szCs w:val="20"/>
+              </w:rPr>
+            </w:pPr>
+            <w:r>
+              <w:rPr>
+                <w:b/>
+                <w:bCs/>
+                <w:sz w:val="20"/>
+                <w:szCs w:val="20"/>
+              </w:rPr>
+              <w:t>Bước</w:t>
+            </w:r>
+          </w:p>
+        </w:tc>
+        <w:tc>
+          <w:tcPr>
+            <w:tcW w:w="0" w:type="auto"/>
+            <w:shd w:val="clear" w:color="auto" w:fill="DAE9F7" w:themeFill="text2" w:themeFillTint="1A"/>
+            <w:hideMark/>
+          </w:tcPr>
+          <w:p>
+            <w:pPr>
+              <w:spacing w:after="160"/>
+              <w:rPr>
+                <w:b/>
+                <w:bCs/>
+                <w:sz w:val="20"/>
+                <w:szCs w:val="20"/>
+              </w:rPr>
+            </w:pPr>
+            <w:r>
+              <w:rPr>
+                <w:b/>
+                <w:bCs/>
+                <w:sz w:val="20"/>
+                <w:szCs w:val="20"/>
+              </w:rPr>
+              <w:t>Hoạt động</w:t>
+            </w:r>
+          </w:p>
+        </w:tc>
+        <w:tc>
+          <w:tcPr>
+            <w:tcW w:w="0" w:type="auto"/>
+            <w:shd w:val="clear" w:color="auto" w:fill="DAE9F7" w:themeFill="text2" w:themeFillTint="1A"/>
+            <w:hideMark/>
+          </w:tcPr>
+          <w:p>
+            <w:pPr>
+              <w:spacing w:after="160"/>
+              <w:rPr>
+                <w:b/>
+                <w:bCs/>
+                <w:sz w:val="20"/>
+                <w:szCs w:val="20"/>
+              </w:rPr>
+            </w:pPr>
+            <w:r>
+              <w:rPr>
+                <w:b/>
+                <w:bCs/>
+                <w:sz w:val="20"/>
+                <w:szCs w:val="20"/>
+              </w:rPr>
+              <w:t>Tác nhân</w:t>
+            </w:r>
+          </w:p>
+        </w:tc>
+        <w:tc>
+          <w:tcPr>
+            <w:tcW w:w="0" w:type="auto"/>
+            <w:shd w:val="clear" w:color="auto" w:fill="DAE9F7" w:themeFill="text2" w:themeFillTint="1A"/>
+            <w:hideMark/>
+          </w:tcPr>
+          <w:p>
+            <w:pPr>
+              <w:spacing w:after="160"/>
+              <w:rPr>
+                <w:b/>
+                <w:bCs/>
+                <w:sz w:val="20"/>
+                <w:szCs w:val="20"/>
+              </w:rPr>
+            </w:pPr>
+            <w:r>
+              <w:rPr>
+                <w:b/>
+                <w:bCs/>
+                <w:sz w:val="20"/>
+                <w:szCs w:val="20"/>
+              </w:rPr>
+              <w:t>PT (phút)</w:t>
+            </w:r>
+          </w:p>
+        </w:tc>
+        <w:tc>
+          <w:tcPr>
+            <w:tcW w:w="0" w:type="auto"/>
+            <w:shd w:val="clear" w:color="auto" w:fill="DAE9F7" w:themeFill="text2" w:themeFillTint="1A"/>
+            <w:hideMark/>
+          </w:tcPr>
+          <w:p>
+            <w:pPr>
+              <w:spacing w:after="160"/>
+              <w:rPr>
+                <w:b/>
+                <w:bCs/>
+                <w:sz w:val="20"/>
+                <w:szCs w:val="20"/>
+              </w:rPr>
+            </w:pPr>
+            <w:r>
+              <w:rPr>
+                <w:b/>
+                <w:bCs/>
+                <w:sz w:val="20"/>
+                <w:szCs w:val="20"/>
+              </w:rPr>
+              <w:t>WT</w:t>
+            </w:r>
+          </w:p>
+        </w:tc>
+        <w:tc>
+          <w:tcPr>
+            <w:tcW w:w="0" w:type="auto"/>
+            <w:shd w:val="clear" w:color="auto" w:fill="DAE9F7" w:themeFill="text2" w:themeFillTint="1A"/>
+            <w:hideMark/>
+          </w:tcPr>
+          <w:p>
+            <w:pPr>
+              <w:spacing w:after="160"/>
+              <w:rPr>
+                <w:b/>
+                <w:bCs/>
+                <w:sz w:val="20"/>
+                <w:szCs w:val="20"/>
+              </w:rPr>
+            </w:pPr>
+            <w:r>
+              <w:rPr>
+                <w:b/>
+                <w:bCs/>
+                <w:sz w:val="20"/>
+                <w:szCs w:val="20"/>
+              </w:rPr>
+              <w:t>Cơ sở / Ghi chú</w:t>
+            </w:r>
+          </w:p>
+        </w:tc>
+      </w:tr>
+      <w:tr>
+        <w:tc>
+          <w:tcPr>
+            <w:tcW w:w="0" w:type="auto"/>
+            <w:hideMark/>
+          </w:tcPr>
+          <w:p>
+            <w:pPr>
+              <w:spacing w:after="160"/>
+              <w:rPr>
+                <w:sz w:val="20"/>
+                <w:szCs w:val="20"/>
+              </w:rPr>
+            </w:pPr>
+            <w:r>
+              <w:rPr>
+                <w:sz w:val="20"/>
+                <w:szCs w:val="20"/>
+              </w:rPr>
+              <w:t>1 (1.1–1.4)</w:t>
+            </w:r>
+          </w:p>
+        </w:tc>
+        <w:tc>
+          <w:tcPr>
+            <w:tcW w:w="0" w:type="auto"/>
+            <w:hideMark/>
+          </w:tcPr>
+          <w:p>
+            <w:pPr>
+              <w:spacing w:after="160"/>
+              <w:rPr>
+                <w:sz w:val="20"/>
+                <w:szCs w:val="20"/>
+              </w:rPr>
+            </w:pPr>
+            <w:r>
+              <w:rPr>
+                <w:sz w:val="20"/>
+                <w:szCs w:val="20"/>
+              </w:rPr>
+              <w:t>Tạo vận đơn, khai báo COD</w:t>
+            </w:r>
+          </w:p>
+        </w:tc>
+        <w:tc>
+          <w:tcPr>
+            <w:tcW w:w="0" w:type="auto"/>
+            <w:hideMark/>
+          </w:tcPr>
+          <w:p>
+            <w:pPr>
+              <w:spacing w:after="160"/>
+              <w:rPr>
+                <w:sz w:val="20"/>
+                <w:szCs w:val="20"/>
+              </w:rPr>
+            </w:pPr>
+            <w:r>
+              <w:rPr>
+                <w:sz w:val="20"/>
+                <w:szCs w:val="20"/>
+              </w:rPr>
+              <w:t>Người gửi</w:t>
+            </w:r>
+          </w:p>
+        </w:tc>
+        <w:tc>
+          <w:tcPr>
+            <w:tcW w:w="0" w:type="auto"/>
+            <w:hideMark/>
+          </w:tcPr>
+          <w:p>
+            <w:pPr>
+              <w:spacing w:after="160"/>
+              <w:rPr>
+                <w:sz w:val="20"/>
+                <w:szCs w:val="20"/>
+              </w:rPr>
+            </w:pPr>
+            <w:r>
+              <w:rPr>
+                <w:sz w:val="20"/>
+                <w:szCs w:val="20"/>
+              </w:rPr>
+              <w:t>Không tính</w:t>
+            </w:r>
+          </w:p>
+        </w:tc>
+        <w:tc>
+          <w:tcPr>
+            <w:tcW w:w="0" w:type="auto"/>
+            <w:hideMark/>
+          </w:tcPr>
+          <w:p>
+            <w:pPr>
+              <w:spacing w:after="160"/>
+              <w:rPr>
+                <w:sz w:val="20"/>
+                <w:szCs w:val="20"/>
+              </w:rPr>
+            </w:pPr>
+            <w:r>
+              <w:rPr>
+                <w:sz w:val="20"/>
+                <w:szCs w:val="20"/>
+              </w:rPr>
+              <w:t>—</w:t>
+            </w:r>
+          </w:p>
+        </w:tc>
+        <w:tc>
+          <w:tcPr>
+            <w:tcW w:w="0" w:type="auto"/>
+            <w:hideMark/>
+          </w:tcPr>
+          <w:p>
+            <w:pPr>
+              <w:spacing w:after="160"/>
+              <w:rPr>
+                <w:sz w:val="20"/>
+                <w:szCs w:val="20"/>
+              </w:rPr>
+            </w:pPr>
+            <w:r>
+              <w:rPr>
+                <w:sz w:val="20"/>
+                <w:szCs w:val="20"/>
+              </w:rPr>
+              <w:t>Tự phục vụ, trước khi vào hệ thống nội bộ</w:t>
+            </w:r>
+          </w:p>
+        </w:tc>
+      </w:tr>
+      <w:tr>
+        <w:tc>
+          <w:tcPr>
+            <w:tcW w:w="0" w:type="auto"/>
+            <w:hideMark/>
+          </w:tcPr>
+          <w:p>
+            <w:pPr>
+              <w:spacing w:after="160"/>
+              <w:rPr>
+                <w:sz w:val="20"/>
+                <w:szCs w:val="20"/>
+              </w:rPr>
+            </w:pPr>
+            <w:r>
+              <w:rPr>
+                <w:sz w:val="20"/>
+                <w:szCs w:val="20"/>
+              </w:rPr>
+              <w:t>2</w:t>
+            </w:r>
+          </w:p>
+        </w:tc>
+        <w:tc>
+          <w:tcPr>
+            <w:tcW w:w="0" w:type="auto"/>
+            <w:hideMark/>
+          </w:tcPr>
+          <w:p>
+            <w:pPr>
+              <w:spacing w:after="160"/>
+              <w:rPr>
+                <w:sz w:val="20"/>
+                <w:szCs w:val="20"/>
+              </w:rPr>
+            </w:pPr>
+            <w:r>
+              <w:rPr>
+                <w:sz w:val="20"/>
+                <w:szCs w:val="20"/>
+              </w:rPr>
+              <w:t>Thông tin đơn hàng</w:t>
+            </w:r>
+          </w:p>
+        </w:tc>
+        <w:tc>
+          <w:tcPr>
+            <w:tcW w:w="0" w:type="auto"/>
+            <w:hideMark/>
+          </w:tcPr>
+          <w:p>
+            <w:pPr>
+              <w:spacing w:after="160"/>
+              <w:rPr>
+                <w:sz w:val="20"/>
+                <w:szCs w:val="20"/>
+              </w:rPr>
+            </w:pPr>
+            <w:r>
+              <w:rPr>
+                <w:sz w:val="20"/>
+                <w:szCs w:val="20"/>
+              </w:rPr>
+              <w:t>Người gửi</w:t>
+            </w:r>
+          </w:p>
+        </w:tc>
+        <w:tc>
+          <w:tcPr>
+            <w:tcW w:w="0" w:type="auto"/>
+            <w:hideMark/>
+          </w:tcPr>
+          <w:p>
+            <w:pPr>
+              <w:spacing w:after="160"/>
+              <w:rPr>
+                <w:sz w:val="20"/>
+                <w:szCs w:val="20"/>
+              </w:rPr>
+            </w:pPr>
+            <w:r>
+              <w:rPr>
+                <w:sz w:val="20"/>
+                <w:szCs w:val="20"/>
+              </w:rPr>
+              <w:t>Không tính</w:t>
+            </w:r>
+          </w:p>
+        </w:tc>
+        <w:tc>
+          <w:tcPr>
+            <w:tcW w:w="0" w:type="auto"/>
+            <w:hideMark/>
+          </w:tcPr>
+          <w:p>
+            <w:pPr>
+              <w:spacing w:after="160"/>
+              <w:rPr>
+                <w:sz w:val="20"/>
+                <w:szCs w:val="20"/>
+              </w:rPr>
+            </w:pPr>
+            <w:r>
+              <w:rPr>
+                <w:sz w:val="20"/>
+                <w:szCs w:val="20"/>
+              </w:rPr>
+              <w:t>—</w:t>
+            </w:r>
+          </w:p>
+        </w:tc>
+        <w:tc>
+          <w:tcPr>
+            <w:tcW w:w="0" w:type="auto"/>
+            <w:hideMark/>
+          </w:tcPr>
+          <w:p>
+            <w:pPr>
+              <w:spacing w:after="160"/>
+              <w:rPr>
+                <w:sz w:val="20"/>
+                <w:szCs w:val="20"/>
+              </w:rPr>
+            </w:pPr>
+            <w:r>
+              <w:rPr>
+                <w:sz w:val="20"/>
+                <w:szCs w:val="20"/>
+              </w:rPr>
+              <w:t>Như trên</w:t>
+            </w:r>
+          </w:p>
+        </w:tc>
+      </w:tr>
+      <w:tr>
+        <w:tc>
+          <w:tcPr>
+            <w:tcW w:w="0" w:type="auto"/>
+            <w:hideMark/>
+          </w:tcPr>
+          <w:p>
+            <w:pPr>
+              <w:spacing w:after="160"/>
+              <w:rPr>
+                <w:sz w:val="20"/>
+                <w:szCs w:val="20"/>
+              </w:rPr>
+            </w:pPr>
+            <w:r>
+              <w:rPr>
+                <w:sz w:val="20"/>
+                <w:szCs w:val="20"/>
+              </w:rPr>
+              <w:t>3</w:t>
+            </w:r>
+          </w:p>
+        </w:tc>
+        <w:tc>
+          <w:tcPr>
+            <w:tcW w:w="0" w:type="auto"/>
+            <w:hideMark/>
+          </w:tcPr>
+          <w:p>
+            <w:pPr>
+              <w:spacing w:after="160"/>
+              <w:rPr>
+                <w:sz w:val="20"/>
+                <w:szCs w:val="20"/>
+              </w:rPr>
+            </w:pPr>
+            <w:r>
+              <w:rPr>
+                <w:sz w:val="20"/>
+                <w:szCs w:val="20"/>
+              </w:rPr>
+              <w:t>Tiếp nhận thông tin vận đơn</w:t>
+            </w:r>
+          </w:p>
+        </w:tc>
+        <w:tc>
+          <w:tcPr>
+            <w:tcW w:w="0" w:type="auto"/>
+            <w:hideMark/>
+          </w:tcPr>
+          <w:p>
+            <w:pPr>
+              <w:spacing w:after="160"/>
+              <w:rPr>
+                <w:sz w:val="20"/>
+                <w:szCs w:val="20"/>
+              </w:rPr>
+            </w:pPr>
+            <w:r>
+              <w:rPr>
+                <w:sz w:val="20"/>
+                <w:szCs w:val="20"/>
+              </w:rPr>
+              <w:t>Bưu cục</w:t>
+            </w:r>
+          </w:p>
+        </w:tc>
+        <w:tc>
+          <w:tcPr>
+            <w:tcW w:w="0" w:type="auto"/>
+            <w:hideMark/>
+          </w:tcPr>
+          <w:p>
+            <w:pPr>
+              <w:spacing w:after="160"/>
+              <w:rPr>
+                <w:sz w:val="20"/>
+                <w:szCs w:val="20"/>
+              </w:rPr>
+            </w:pPr>
+            <w:r>
+              <w:rPr>
+                <w:sz w:val="20"/>
+                <w:szCs w:val="20"/>
+              </w:rPr>
+              <w:t>3'</w:t>
+            </w:r>
+          </w:p>
+        </w:tc>
+        <w:tc>
+          <w:tcPr>
+            <w:tcW w:w="0" w:type="auto"/>
+            <w:hideMark/>
+          </w:tcPr>
+          <w:p>
+            <w:pPr>
+              <w:spacing w:after="160"/>
+              <w:rPr>
+                <w:sz w:val="20"/>
+                <w:szCs w:val="20"/>
+              </w:rPr>
+            </w:pPr>
+            <w:r>
+              <w:rPr>
+                <w:sz w:val="20"/>
+                <w:szCs w:val="20"/>
+              </w:rPr>
+              <w:t>—</w:t>
+            </w:r>
+          </w:p>
+        </w:tc>
+        <w:tc>
+          <w:tcPr>
+            <w:tcW w:w="0" w:type="auto"/>
+            <w:hideMark/>
+          </w:tcPr>
+          <w:p>
+            <w:pPr>
+              <w:spacing w:after="160"/>
+              <w:rPr>
+                <w:sz w:val="20"/>
+                <w:szCs w:val="20"/>
+              </w:rPr>
+            </w:pPr>
+            <w:r>
+              <w:rPr>
+                <w:sz w:val="20"/>
+                <w:szCs w:val="20"/>
+              </w:rPr>
+              <w:t>1 trong 4 số hạng PT=3+3+5+5</w:t>
+            </w:r>
+          </w:p>
+        </w:tc>
+      </w:tr>
+      <w:tr>
+        <w:tc>
+          <w:tcPr>
+            <w:tcW w:w="0" w:type="auto"/>
+            <w:hideMark/>
+          </w:tcPr>
+          <w:p>
+            <w:pPr>
+              <w:spacing w:after="160"/>
+              <w:rPr>
+                <w:sz w:val="20"/>
+                <w:szCs w:val="20"/>
+              </w:rPr>
+            </w:pPr>
+            <w:r>
+              <w:rPr>
+                <w:sz w:val="20"/>
+                <w:szCs w:val="20"/>
+              </w:rPr>
+              <w:t>4</w:t>
+            </w:r>
+          </w:p>
+        </w:tc>
+        <w:tc>
+          <w:tcPr>
+            <w:tcW w:w="0" w:type="auto"/>
+            <w:hideMark/>
+          </w:tcPr>
+          <w:p>
+            <w:pPr>
+              <w:spacing w:after="160"/>
+              <w:rPr>
+                <w:sz w:val="20"/>
+                <w:szCs w:val="20"/>
+              </w:rPr>
+            </w:pPr>
+            <w:r>
+              <w:rPr>
+                <w:sz w:val="20"/>
+                <w:szCs w:val="20"/>
+              </w:rPr>
+              <w:t>Kiểm tra điều kiện đơn hàng &amp; phí COD</w:t>
+            </w:r>
+          </w:p>
+        </w:tc>
+        <w:tc>
+          <w:tcPr>
+            <w:tcW w:w="0" w:type="auto"/>
+            <w:hideMark/>
+          </w:tcPr>
+          <w:p>
+            <w:pPr>
+              <w:spacing w:after="160"/>
+              <w:rPr>
+                <w:sz w:val="20"/>
+                <w:szCs w:val="20"/>
+              </w:rPr>
+            </w:pPr>
+            <w:r>
+              <w:rPr>
+                <w:sz w:val="20"/>
+                <w:szCs w:val="20"/>
+              </w:rPr>
+              <w:t>Bưu cục</w:t>
+            </w:r>
+          </w:p>
+        </w:tc>
+        <w:tc>
+          <w:tcPr>
+            <w:tcW w:w="0" w:type="auto"/>
+            <w:hideMark/>
+          </w:tcPr>
+          <w:p>
+            <w:pPr>
+              <w:spacing w:after="160"/>
+              <w:rPr>
+                <w:sz w:val="20"/>
+                <w:szCs w:val="20"/>
+              </w:rPr>
+            </w:pPr>
+            <w:r>
+              <w:rPr>
+                <w:sz w:val="20"/>
+                <w:szCs w:val="20"/>
+              </w:rPr>
+              <w:t>3'</w:t>
+            </w:r>
+          </w:p>
+        </w:tc>
+        <w:tc>
+          <w:tcPr>
+            <w:tcW w:w="0" w:type="auto"/>
+            <w:hideMark/>
+          </w:tcPr>
+          <w:p>
+            <w:pPr>
+              <w:spacing w:after="160"/>
+              <w:rPr>
+                <w:sz w:val="20"/>
+                <w:szCs w:val="20"/>
+              </w:rPr>
+            </w:pPr>
+            <w:r>
+              <w:rPr>
+                <w:sz w:val="20"/>
+                <w:szCs w:val="20"/>
+              </w:rPr>
+              <w:t>—</w:t>
+            </w:r>
+          </w:p>
+        </w:tc>
+        <w:tc>
+          <w:tcPr>
+            <w:tcW w:w="0" w:type="auto"/>
+            <w:hideMark/>
+          </w:tcPr>
+          <w:p>
+            <w:pPr>
+              <w:spacing w:after="160"/>
+              <w:rPr>
+                <w:sz w:val="20"/>
+                <w:szCs w:val="20"/>
+              </w:rPr>
+            </w:pPr>
+            <w:r>
+              <w:rPr>
+                <w:sz w:val="20"/>
+                <w:szCs w:val="20"/>
+              </w:rPr>
+              <w:t>nt</w:t>
+            </w:r>
+          </w:p>
+        </w:tc>
+      </w:tr>
+      <w:tr>
+        <w:tc>
+          <w:tcPr>
+            <w:tcW w:w="0" w:type="auto"/>
+            <w:hideMark/>
+          </w:tcPr>
+          <w:p>
+            <w:pPr>
+              <w:spacing w:after="160"/>
+              <w:rPr>
+                <w:sz w:val="20"/>
+                <w:szCs w:val="20"/>
+              </w:rPr>
+            </w:pPr>
+            <w:r>
+              <w:rPr>
+                <w:sz w:val="20"/>
+                <w:szCs w:val="20"/>
+              </w:rPr>
+              <w:t>5</w:t>
+            </w:r>
+          </w:p>
+        </w:tc>
+        <w:tc>
+          <w:tcPr>
+            <w:tcW w:w="0" w:type="auto"/>
+            <w:hideMark/>
+          </w:tcPr>
+          <w:p>
+            <w:pPr>
+              <w:spacing w:after="160"/>
+              <w:rPr>
+                <w:sz w:val="20"/>
+                <w:szCs w:val="20"/>
+              </w:rPr>
+            </w:pPr>
+            <w:r>
+              <w:rPr>
+                <w:sz w:val="20"/>
+                <w:szCs w:val="20"/>
+              </w:rPr>
+              <w:t>Phân loại hàng hóa theo tuyến</w:t>
+            </w:r>
+          </w:p>
+        </w:tc>
+        <w:tc>
+          <w:tcPr>
+            <w:tcW w:w="0" w:type="auto"/>
+            <w:hideMark/>
+          </w:tcPr>
+          <w:p>
+            <w:pPr>
+              <w:spacing w:after="160"/>
+              <w:rPr>
+                <w:sz w:val="20"/>
+                <w:szCs w:val="20"/>
+              </w:rPr>
+            </w:pPr>
+            <w:r>
+              <w:rPr>
+                <w:sz w:val="20"/>
+                <w:szCs w:val="20"/>
+              </w:rPr>
+              <w:t>Bưu cục</w:t>
+            </w:r>
+          </w:p>
+        </w:tc>
+        <w:tc>
+          <w:tcPr>
+            <w:tcW w:w="0" w:type="auto"/>
+            <w:hideMark/>
+          </w:tcPr>
+          <w:p>
+            <w:pPr>
+              <w:spacing w:after="160"/>
+              <w:rPr>
+                <w:sz w:val="20"/>
+                <w:szCs w:val="20"/>
+              </w:rPr>
+            </w:pPr>
+            <w:r>
+              <w:rPr>
+                <w:sz w:val="20"/>
+                <w:szCs w:val="20"/>
+              </w:rPr>
+              <w:t>5'</w:t>
+            </w:r>
+          </w:p>
+        </w:tc>
+        <w:tc>
+          <w:tcPr>
+            <w:tcW w:w="0" w:type="auto"/>
+            <w:hideMark/>
+          </w:tcPr>
+          <w:p>
+            <w:pPr>
+              <w:spacing w:after="160"/>
+              <w:rPr>
+                <w:sz w:val="20"/>
+                <w:szCs w:val="20"/>
+              </w:rPr>
+            </w:pPr>
+            <w:r>
+              <w:rPr>
+                <w:b/>
+                <w:bCs/>
+                <w:sz w:val="20"/>
+                <w:szCs w:val="20"/>
+              </w:rPr>
+              <w:t>10h</w:t>
+            </w:r>
+          </w:p>
+        </w:tc>
+        <w:tc>
+          <w:tcPr>
+            <w:tcW w:w="0" w:type="auto"/>
+            <w:hideMark/>
+          </w:tcPr>
+          <w:p>
+            <w:pPr>
+              <w:spacing w:after="160"/>
+              <w:rPr>
+                <w:sz w:val="20"/>
+                <w:szCs w:val="20"/>
+              </w:rPr>
+            </w:pPr>
+            <w:r>
+              <w:rPr>
+                <w:sz w:val="20"/>
+                <w:szCs w:val="20"/>
+              </w:rPr>
+              <w:t xml:space="preserve">PT: thao tác phân loại. WT: chờ gom đủ hàng theo tuyến </w:t>
+            </w:r>
+            <w:r>
+              <w:rPr>
+                <w:i/>
+                <w:iCs/>
+                <w:sz w:val="20"/>
+                <w:szCs w:val="20"/>
+              </w:rPr>
+              <w:t>(giả định)</w:t>
+            </w:r>
+          </w:p>
+        </w:tc>
+      </w:tr>
+      <w:tr>
+        <w:tc>
+          <w:tcPr>
+            <w:tcW w:w="0" w:type="auto"/>
+            <w:hideMark/>
+          </w:tcPr>
+          <w:p>
+            <w:pPr>
+              <w:spacing w:after="160"/>
+              <w:rPr>
+                <w:sz w:val="20"/>
+                <w:szCs w:val="20"/>
+              </w:rPr>
+            </w:pPr>
+            <w:r>
+              <w:rPr>
+                <w:sz w:val="20"/>
+                <w:szCs w:val="20"/>
+              </w:rPr>
+              <w:t>6</w:t>
+            </w:r>
+          </w:p>
+        </w:tc>
+        <w:tc>
+          <w:tcPr>
+            <w:tcW w:w="0" w:type="auto"/>
+            <w:hideMark/>
+          </w:tcPr>
+          <w:p>
+            <w:pPr>
+              <w:spacing w:after="160"/>
+              <w:rPr>
+                <w:sz w:val="20"/>
+                <w:szCs w:val="20"/>
+              </w:rPr>
+            </w:pPr>
+            <w:r>
+              <w:rPr>
+                <w:sz w:val="20"/>
+                <w:szCs w:val="20"/>
+              </w:rPr>
+              <w:t>Điều phối vận chuyển</w:t>
+            </w:r>
+          </w:p>
+        </w:tc>
+        <w:tc>
+          <w:tcPr>
+            <w:tcW w:w="0" w:type="auto"/>
+            <w:hideMark/>
+          </w:tcPr>
+          <w:p>
+            <w:pPr>
+              <w:spacing w:after="160"/>
+              <w:rPr>
+                <w:sz w:val="20"/>
+                <w:szCs w:val="20"/>
+              </w:rPr>
+            </w:pPr>
+            <w:r>
+              <w:rPr>
+                <w:sz w:val="20"/>
+                <w:szCs w:val="20"/>
+              </w:rPr>
+              <w:t>Bưu cục</w:t>
+            </w:r>
+          </w:p>
+        </w:tc>
+        <w:tc>
+          <w:tcPr>
+            <w:tcW w:w="0" w:type="auto"/>
+            <w:hideMark/>
+          </w:tcPr>
+          <w:p>
+            <w:pPr>
+              <w:spacing w:after="160"/>
+              <w:rPr>
+                <w:sz w:val="20"/>
+                <w:szCs w:val="20"/>
+              </w:rPr>
+            </w:pPr>
+            <w:r>
+              <w:rPr>
+                <w:sz w:val="20"/>
+                <w:szCs w:val="20"/>
+              </w:rPr>
+              <w:t>—</w:t>
+            </w:r>
+          </w:p>
+        </w:tc>
+        <w:tc>
+          <w:tcPr>
+            <w:tcW w:w="0" w:type="auto"/>
+            <w:hideMark/>
+          </w:tcPr>
+          <w:p>
+            <w:pPr>
+              <w:spacing w:after="160"/>
+              <w:rPr>
+                <w:sz w:val="20"/>
+                <w:szCs w:val="20"/>
+              </w:rPr>
+            </w:pPr>
+            <w:r>
+              <w:rPr>
+                <w:b/>
+                <w:bCs/>
+                <w:sz w:val="20"/>
+                <w:szCs w:val="20"/>
+              </w:rPr>
+              <w:t>2h</w:t>
+            </w:r>
+          </w:p>
+        </w:tc>
+        <w:tc>
+          <w:tcPr>
+            <w:tcW w:w="0" w:type="auto"/>
+            <w:hideMark/>
+          </w:tcPr>
+          <w:p>
+            <w:pPr>
+              <w:spacing w:after="160"/>
+              <w:rPr>
+                <w:sz w:val="20"/>
+                <w:szCs w:val="20"/>
+              </w:rPr>
+            </w:pPr>
+            <w:r>
+              <w:rPr>
+                <w:sz w:val="20"/>
+                <w:szCs w:val="20"/>
+              </w:rPr>
+              <w:t xml:space="preserve">WT chờ phân công vận chuyển </w:t>
+            </w:r>
+            <w:r>
+              <w:rPr>
+                <w:i/>
+                <w:iCs/>
+                <w:sz w:val="20"/>
+                <w:szCs w:val="20"/>
+              </w:rPr>
+              <w:t>(giả định)</w:t>
+            </w:r>
+          </w:p>
+        </w:tc>
+      </w:tr>
+      <w:tr>
+        <w:tc>
+          <w:tcPr>
+            <w:tcW w:w="0" w:type="auto"/>
+            <w:hideMark/>
+          </w:tcPr>
+          <w:p>
+            <w:pPr>
+              <w:spacing w:after="160"/>
+              <w:rPr>
+                <w:sz w:val="20"/>
+                <w:szCs w:val="20"/>
+              </w:rPr>
+            </w:pPr>
+            <w:r>
+              <w:rPr>
+                <w:sz w:val="20"/>
+                <w:szCs w:val="20"/>
+              </w:rPr>
+              <w:t>7</w:t>
+            </w:r>
+          </w:p>
+        </w:tc>
+        <w:tc>
+          <w:tcPr>
+            <w:tcW w:w="0" w:type="auto"/>
+            <w:hideMark/>
+          </w:tcPr>
+          <w:p>
+            <w:pPr>
+              <w:spacing w:after="160"/>
+              <w:rPr>
+                <w:sz w:val="20"/>
+                <w:szCs w:val="20"/>
+              </w:rPr>
+            </w:pPr>
+            <w:r>
+              <w:rPr>
+                <w:sz w:val="20"/>
+                <w:szCs w:val="20"/>
+              </w:rPr>
+              <w:t>Luân chuyển hàng giữa các trung tâm</w:t>
+            </w:r>
+          </w:p>
+        </w:tc>
+        <w:tc>
+          <w:tcPr>
+            <w:tcW w:w="0" w:type="auto"/>
+            <w:hideMark/>
+          </w:tcPr>
+          <w:p>
+            <w:pPr>
+              <w:spacing w:after="160"/>
+              <w:rPr>
+                <w:sz w:val="20"/>
+                <w:szCs w:val="20"/>
+              </w:rPr>
+            </w:pPr>
+            <w:r>
+              <w:rPr>
+                <w:sz w:val="20"/>
+                <w:szCs w:val="20"/>
+              </w:rPr>
+              <w:t>Bưu cục</w:t>
+            </w:r>
+          </w:p>
+        </w:tc>
+        <w:tc>
+          <w:tcPr>
+            <w:tcW w:w="0" w:type="auto"/>
+            <w:hideMark/>
+          </w:tcPr>
+          <w:p>
+            <w:pPr>
+              <w:spacing w:after="160"/>
+              <w:rPr>
+                <w:sz w:val="20"/>
+                <w:szCs w:val="20"/>
+              </w:rPr>
+            </w:pPr>
+            <w:r>
+              <w:rPr>
+                <w:sz w:val="20"/>
+                <w:szCs w:val="20"/>
+              </w:rPr>
+              <w:t>—</w:t>
+            </w:r>
+          </w:p>
+        </w:tc>
+        <w:tc>
+          <w:tcPr>
+            <w:tcW w:w="0" w:type="auto"/>
+            <w:hideMark/>
+          </w:tcPr>
+          <w:p>
+            <w:pPr>
+              <w:spacing w:after="160"/>
+              <w:rPr>
+                <w:sz w:val="20"/>
+                <w:szCs w:val="20"/>
+              </w:rPr>
+            </w:pPr>
+            <w:r>
+              <w:rPr>
+                <w:b/>
+                <w:bCs/>
+                <w:sz w:val="20"/>
+                <w:szCs w:val="20"/>
+              </w:rPr>
+              <w:t>24h</w:t>
+            </w:r>
+          </w:p>
+        </w:tc>
+        <w:tc>
+          <w:tcPr>
+            <w:tcW w:w="0" w:type="auto"/>
+            <w:hideMark/>
+          </w:tcPr>
+          <w:p>
+            <w:pPr>
+              <w:spacing w:after="160"/>
+              <w:rPr>
+                <w:sz w:val="20"/>
+                <w:szCs w:val="20"/>
+              </w:rPr>
+            </w:pPr>
+            <w:r>
+              <w:rPr>
+                <w:sz w:val="20"/>
+                <w:szCs w:val="20"/>
+              </w:rPr>
+              <w:t xml:space="preserve">WT xử lý sơ bộ tại trung tâm trung chuyển </w:t>
+            </w:r>
+            <w:r>
+              <w:rPr>
+                <w:i/>
+                <w:iCs/>
+                <w:sz w:val="20"/>
+                <w:szCs w:val="20"/>
+              </w:rPr>
+              <w:t>(giả định)</w:t>
+            </w:r>
+          </w:p>
+        </w:tc>
+      </w:tr>
+      <w:tr>
+        <w:tc>
+          <w:tcPr>
+            <w:tcW w:w="0" w:type="auto"/>
+            <w:hideMark/>
+          </w:tcPr>
+          <w:p>
+            <w:pPr>
+              <w:spacing w:after="160"/>
+              <w:rPr>
+                <w:sz w:val="20"/>
+                <w:szCs w:val="20"/>
+              </w:rPr>
+            </w:pPr>
+            <w:r>
+              <w:rPr>
+                <w:sz w:val="20"/>
+                <w:szCs w:val="20"/>
+              </w:rPr>
+              <w:t>8</w:t>
+            </w:r>
+          </w:p>
+        </w:tc>
+        <w:tc>
+          <w:tcPr>
+            <w:tcW w:w="0" w:type="auto"/>
+            <w:hideMark/>
+          </w:tcPr>
+          <w:p>
+            <w:pPr>
+              <w:spacing w:after="160"/>
+              <w:rPr>
+                <w:sz w:val="20"/>
+                <w:szCs w:val="20"/>
+              </w:rPr>
+            </w:pPr>
+            <w:r>
+              <w:rPr>
+                <w:sz w:val="20"/>
+                <w:szCs w:val="20"/>
+              </w:rPr>
+              <w:t>Ghi nhận vận đơn &amp; giá trị COD</w:t>
+            </w:r>
+          </w:p>
+        </w:tc>
+        <w:tc>
+          <w:tcPr>
+            <w:tcW w:w="0" w:type="auto"/>
+            <w:hideMark/>
+          </w:tcPr>
+          <w:p>
+            <w:pPr>
+              <w:spacing w:after="160"/>
+              <w:rPr>
+                <w:sz w:val="20"/>
+                <w:szCs w:val="20"/>
+              </w:rPr>
+            </w:pPr>
+            <w:r>
+              <w:rPr>
+                <w:sz w:val="20"/>
+                <w:szCs w:val="20"/>
+              </w:rPr>
+              <w:t>Bưu cục</w:t>
+            </w:r>
+          </w:p>
+        </w:tc>
+        <w:tc>
+          <w:tcPr>
+            <w:tcW w:w="0" w:type="auto"/>
+            <w:hideMark/>
+          </w:tcPr>
+          <w:p>
+            <w:pPr>
+              <w:spacing w:after="160"/>
+              <w:rPr>
+                <w:sz w:val="20"/>
+                <w:szCs w:val="20"/>
+              </w:rPr>
+            </w:pPr>
+            <w:r>
+              <w:rPr>
+                <w:sz w:val="20"/>
+                <w:szCs w:val="20"/>
+              </w:rPr>
+              <w:t>5'</w:t>
+            </w:r>
+          </w:p>
+        </w:tc>
+        <w:tc>
+          <w:tcPr>
+            <w:tcW w:w="0" w:type="auto"/>
+            <w:hideMark/>
+          </w:tcPr>
+          <w:p>
+            <w:pPr>
+              <w:spacing w:after="160"/>
+              <w:rPr>
+                <w:sz w:val="20"/>
+                <w:szCs w:val="20"/>
+              </w:rPr>
+            </w:pPr>
+            <w:r>
+              <w:rPr>
+                <w:sz w:val="20"/>
+                <w:szCs w:val="20"/>
+              </w:rPr>
+              <w:t>—</w:t>
+            </w:r>
+          </w:p>
+        </w:tc>
+        <w:tc>
+          <w:tcPr>
+            <w:tcW w:w="0" w:type="auto"/>
+            <w:hideMark/>
+          </w:tcPr>
+          <w:p>
+            <w:pPr>
+              <w:spacing w:after="160"/>
+              <w:rPr>
+                <w:sz w:val="20"/>
+                <w:szCs w:val="20"/>
+              </w:rPr>
+            </w:pPr>
+            <w:r>
+              <w:rPr>
+                <w:sz w:val="20"/>
+                <w:szCs w:val="20"/>
+              </w:rPr>
+              <w:t>Số hạng PT còn lại (3+3+</w:t>
+            </w:r>
+            <w:r>
+              <w:rPr>
+                <w:b/>
+                <w:bCs/>
+                <w:sz w:val="20"/>
+                <w:szCs w:val="20"/>
+              </w:rPr>
+              <w:t>5+5</w:t>
+            </w:r>
+            <w:r>
+              <w:rPr>
+                <w:sz w:val="20"/>
+                <w:szCs w:val="20"/>
+              </w:rPr>
+              <w:t>=16)</w:t>
+            </w:r>
+          </w:p>
+        </w:tc>
+      </w:tr>
+      <w:tr>
+        <w:tc>
+          <w:tcPr>
+            <w:tcW w:w="0" w:type="auto"/>
+            <w:hideMark/>
+          </w:tcPr>
+          <w:p>
+            <w:pPr>
+              <w:spacing w:after="160"/>
+              <w:rPr>
+                <w:sz w:val="20"/>
+                <w:szCs w:val="20"/>
+              </w:rPr>
+            </w:pPr>
+            <w:r>
+              <w:rPr>
+                <w:sz w:val="20"/>
+                <w:szCs w:val="20"/>
+              </w:rPr>
+              <w:t>9</w:t>
+            </w:r>
+          </w:p>
+        </w:tc>
+        <w:tc>
+          <w:tcPr>
+            <w:tcW w:w="0" w:type="auto"/>
+            <w:hideMark/>
+          </w:tcPr>
+          <w:p>
+            <w:pPr>
+              <w:spacing w:after="160"/>
+              <w:rPr>
+                <w:sz w:val="20"/>
+                <w:szCs w:val="20"/>
+              </w:rPr>
+            </w:pPr>
+            <w:r>
+              <w:rPr>
+                <w:sz w:val="20"/>
+                <w:szCs w:val="20"/>
+              </w:rPr>
+              <w:t>Tiếp nhận đơn hàng</w:t>
+            </w:r>
+          </w:p>
+        </w:tc>
+        <w:tc>
+          <w:tcPr>
+            <w:tcW w:w="0" w:type="auto"/>
+            <w:hideMark/>
+          </w:tcPr>
+          <w:p>
+            <w:pPr>
+              <w:spacing w:after="160"/>
+              <w:rPr>
+                <w:sz w:val="20"/>
+                <w:szCs w:val="20"/>
+              </w:rPr>
+            </w:pPr>
+            <w:r>
+              <w:rPr>
+                <w:sz w:val="20"/>
+                <w:szCs w:val="20"/>
+              </w:rPr>
+              <w:t>Người Lấy Hàng</w:t>
+            </w:r>
+          </w:p>
+        </w:tc>
+        <w:tc>
+          <w:tcPr>
+            <w:tcW w:w="0" w:type="auto"/>
+            <w:hideMark/>
+          </w:tcPr>
+          <w:p>
+            <w:pPr>
+              <w:spacing w:after="160"/>
+              <w:rPr>
+                <w:sz w:val="20"/>
+                <w:szCs w:val="20"/>
+              </w:rPr>
+            </w:pPr>
+            <w:r>
+              <w:rPr>
+                <w:sz w:val="20"/>
+                <w:szCs w:val="20"/>
+              </w:rPr>
+              <w:t>3'</w:t>
+            </w:r>
+          </w:p>
+        </w:tc>
+        <w:tc>
+          <w:tcPr>
+            <w:tcW w:w="0" w:type="auto"/>
+            <w:hideMark/>
+          </w:tcPr>
+          <w:p>
+            <w:pPr>
+              <w:spacing w:after="160"/>
+              <w:rPr>
+                <w:sz w:val="20"/>
+                <w:szCs w:val="20"/>
+              </w:rPr>
+            </w:pPr>
+            <w:r>
+              <w:rPr>
+                <w:sz w:val="20"/>
+                <w:szCs w:val="20"/>
+              </w:rPr>
+              <w:t>0</w:t>
+            </w:r>
+          </w:p>
+        </w:tc>
+        <w:tc>
+          <w:tcPr>
+            <w:tcW w:w="0" w:type="auto"/>
+            <w:hideMark/>
+          </w:tcPr>
+          <w:p>
+            <w:pPr>
+              <w:spacing w:after="160"/>
+              <w:rPr>
+                <w:sz w:val="20"/>
+                <w:szCs w:val="20"/>
+              </w:rPr>
+            </w:pPr>
+            <w:r>
+              <w:rPr>
+                <w:sz w:val="20"/>
+                <w:szCs w:val="20"/>
+              </w:rPr>
+              <w:t>PT=3+2+2+20, khớp đúng 4 bước 9–12</w:t>
+            </w:r>
+          </w:p>
+        </w:tc>
+      </w:tr>
+      <w:tr>
+        <w:tc>
+          <w:tcPr>
+            <w:tcW w:w="0" w:type="auto"/>
+            <w:hideMark/>
+          </w:tcPr>
+          <w:p>
+            <w:pPr>
+              <w:spacing w:after="160"/>
+              <w:rPr>
+                <w:sz w:val="20"/>
+                <w:szCs w:val="20"/>
+              </w:rPr>
+            </w:pPr>
+            <w:r>
+              <w:rPr>
+                <w:sz w:val="20"/>
+                <w:szCs w:val="20"/>
+              </w:rPr>
+              <w:t>10</w:t>
+            </w:r>
+          </w:p>
+        </w:tc>
+        <w:tc>
+          <w:tcPr>
+            <w:tcW w:w="0" w:type="auto"/>
+            <w:hideMark/>
+          </w:tcPr>
+          <w:p>
+            <w:pPr>
+              <w:spacing w:after="160"/>
+              <w:rPr>
+                <w:sz w:val="20"/>
+                <w:szCs w:val="20"/>
+              </w:rPr>
+            </w:pPr>
+            <w:r>
+              <w:rPr>
+                <w:sz w:val="20"/>
+                <w:szCs w:val="20"/>
+              </w:rPr>
+              <w:t>Xác nhận thông tin đơn</w:t>
+            </w:r>
+          </w:p>
+        </w:tc>
+        <w:tc>
+          <w:tcPr>
+            <w:tcW w:w="0" w:type="auto"/>
+            <w:hideMark/>
+          </w:tcPr>
+          <w:p>
+            <w:pPr>
+              <w:spacing w:after="160"/>
+              <w:rPr>
+                <w:sz w:val="20"/>
+                <w:szCs w:val="20"/>
+              </w:rPr>
+            </w:pPr>
+            <w:r>
+              <w:rPr>
+                <w:sz w:val="20"/>
+                <w:szCs w:val="20"/>
+              </w:rPr>
+              <w:t>Người Lấy Hàng</w:t>
+            </w:r>
+          </w:p>
+        </w:tc>
+        <w:tc>
+          <w:tcPr>
+            <w:tcW w:w="0" w:type="auto"/>
+            <w:hideMark/>
+          </w:tcPr>
+          <w:p>
+            <w:pPr>
+              <w:spacing w:after="160"/>
+              <w:rPr>
+                <w:sz w:val="20"/>
+                <w:szCs w:val="20"/>
+              </w:rPr>
+            </w:pPr>
+            <w:r>
+              <w:rPr>
+                <w:sz w:val="20"/>
+                <w:szCs w:val="20"/>
+              </w:rPr>
+              <w:t>2'</w:t>
+            </w:r>
+          </w:p>
+        </w:tc>
+        <w:tc>
+          <w:tcPr>
+            <w:tcW w:w="0" w:type="auto"/>
+            <w:hideMark/>
+          </w:tcPr>
+          <w:p>
+            <w:pPr>
+              <w:spacing w:after="160"/>
+              <w:rPr>
+                <w:sz w:val="20"/>
+                <w:szCs w:val="20"/>
+              </w:rPr>
+            </w:pPr>
+            <w:r>
+              <w:rPr>
+                <w:sz w:val="20"/>
+                <w:szCs w:val="20"/>
+              </w:rPr>
+              <w:t>0</w:t>
+            </w:r>
+          </w:p>
+        </w:tc>
+        <w:tc>
+          <w:tcPr>
+            <w:tcW w:w="0" w:type="auto"/>
+            <w:hideMark/>
+          </w:tcPr>
+          <w:p>
+            <w:pPr>
+              <w:spacing w:after="160"/>
+              <w:rPr>
+                <w:sz w:val="20"/>
+                <w:szCs w:val="20"/>
+              </w:rPr>
+            </w:pPr>
+            <w:r>
+              <w:rPr>
+                <w:sz w:val="20"/>
+                <w:szCs w:val="20"/>
+              </w:rPr>
+              <w:t>nt</w:t>
+            </w:r>
+          </w:p>
+        </w:tc>
+      </w:tr>
+      <w:tr>
+        <w:tc>
+          <w:tcPr>
+            <w:tcW w:w="0" w:type="auto"/>
+            <w:hideMark/>
+          </w:tcPr>
+          <w:p>
+            <w:pPr>
+              <w:spacing w:after="160"/>
+              <w:rPr>
+                <w:sz w:val="20"/>
+                <w:szCs w:val="20"/>
+              </w:rPr>
+            </w:pPr>
+            <w:r>
+              <w:rPr>
+                <w:sz w:val="20"/>
+                <w:szCs w:val="20"/>
+              </w:rPr>
+              <w:t>11 (11.1)</w:t>
+            </w:r>
+          </w:p>
+        </w:tc>
+        <w:tc>
+          <w:tcPr>
+            <w:tcW w:w="0" w:type="auto"/>
+            <w:hideMark/>
+          </w:tcPr>
+          <w:p>
+            <w:pPr>
+              <w:spacing w:after="160"/>
+              <w:rPr>
+                <w:sz w:val="20"/>
+                <w:szCs w:val="20"/>
+              </w:rPr>
+            </w:pPr>
+            <w:r>
+              <w:rPr>
+                <w:sz w:val="20"/>
+                <w:szCs w:val="20"/>
+              </w:rPr>
+              <w:t>Liên hệ người gửi</w:t>
+            </w:r>
+          </w:p>
+        </w:tc>
+        <w:tc>
+          <w:tcPr>
+            <w:tcW w:w="0" w:type="auto"/>
+            <w:hideMark/>
+          </w:tcPr>
+          <w:p>
+            <w:pPr>
+              <w:spacing w:after="160"/>
+              <w:rPr>
+                <w:sz w:val="20"/>
+                <w:szCs w:val="20"/>
+              </w:rPr>
+            </w:pPr>
+            <w:r>
+              <w:rPr>
+                <w:sz w:val="20"/>
+                <w:szCs w:val="20"/>
+              </w:rPr>
+              <w:t>Người Lấy Hàng</w:t>
+            </w:r>
+          </w:p>
+        </w:tc>
+        <w:tc>
+          <w:tcPr>
+            <w:tcW w:w="0" w:type="auto"/>
+            <w:hideMark/>
+          </w:tcPr>
+          <w:p>
+            <w:pPr>
+              <w:spacing w:after="160"/>
+              <w:rPr>
+                <w:sz w:val="20"/>
+                <w:szCs w:val="20"/>
+              </w:rPr>
+            </w:pPr>
+            <w:r>
+              <w:rPr>
+                <w:sz w:val="20"/>
+                <w:szCs w:val="20"/>
+              </w:rPr>
+              <w:t>2'</w:t>
+            </w:r>
+          </w:p>
+        </w:tc>
+        <w:tc>
+          <w:tcPr>
+            <w:tcW w:w="0" w:type="auto"/>
+            <w:hideMark/>
+          </w:tcPr>
+          <w:p>
+            <w:pPr>
+              <w:spacing w:after="160"/>
+              <w:rPr>
+                <w:sz w:val="20"/>
+                <w:szCs w:val="20"/>
+              </w:rPr>
+            </w:pPr>
+            <w:r>
+              <w:rPr>
+                <w:sz w:val="20"/>
+                <w:szCs w:val="20"/>
+              </w:rPr>
+              <w:t>0</w:t>
+            </w:r>
+          </w:p>
+        </w:tc>
+        <w:tc>
+          <w:tcPr>
+            <w:tcW w:w="0" w:type="auto"/>
+            <w:hideMark/>
+          </w:tcPr>
+          <w:p>
+            <w:pPr>
+              <w:spacing w:after="160"/>
+              <w:rPr>
+                <w:sz w:val="20"/>
+                <w:szCs w:val="20"/>
+              </w:rPr>
+            </w:pPr>
+            <w:r>
+              <w:rPr>
+                <w:sz w:val="20"/>
+                <w:szCs w:val="20"/>
+              </w:rPr>
+              <w:t>nt</w:t>
+            </w:r>
+          </w:p>
+        </w:tc>
+      </w:tr>
+      <w:tr>
+        <w:tc>
+          <w:tcPr>
+            <w:tcW w:w="0" w:type="auto"/>
+            <w:hideMark/>
+          </w:tcPr>
+          <w:p>
+            <w:pPr>
+              <w:spacing w:after="160"/>
+              <w:rPr>
+                <w:sz w:val="20"/>
+                <w:szCs w:val="20"/>
+              </w:rPr>
+            </w:pPr>
+            <w:r>
+              <w:rPr>
+                <w:sz w:val="20"/>
+                <w:szCs w:val="20"/>
+              </w:rPr>
+              <w:t>12</w:t>
+            </w:r>
+          </w:p>
+        </w:tc>
+        <w:tc>
+          <w:tcPr>
+            <w:tcW w:w="0" w:type="auto"/>
+            <w:hideMark/>
+          </w:tcPr>
+          <w:p>
+            <w:pPr>
+              <w:spacing w:after="160"/>
+              <w:rPr>
+                <w:sz w:val="20"/>
+                <w:szCs w:val="20"/>
+              </w:rPr>
+            </w:pPr>
+            <w:r>
+              <w:rPr>
+                <w:sz w:val="20"/>
+                <w:szCs w:val="20"/>
+              </w:rPr>
+              <w:t>Vận chuyển về bưu cục, cập nhật</w:t>
+            </w:r>
+          </w:p>
+        </w:tc>
+        <w:tc>
+          <w:tcPr>
+            <w:tcW w:w="0" w:type="auto"/>
+            <w:hideMark/>
+          </w:tcPr>
+          <w:p>
+            <w:pPr>
+              <w:spacing w:after="160"/>
+              <w:rPr>
+                <w:sz w:val="20"/>
+                <w:szCs w:val="20"/>
+              </w:rPr>
+            </w:pPr>
+            <w:r>
+              <w:rPr>
+                <w:sz w:val="20"/>
+                <w:szCs w:val="20"/>
+              </w:rPr>
+              <w:t>Người Lấy Hàng</w:t>
+            </w:r>
+          </w:p>
+        </w:tc>
+        <w:tc>
+          <w:tcPr>
+            <w:tcW w:w="0" w:type="auto"/>
+            <w:hideMark/>
+          </w:tcPr>
+          <w:p>
+            <w:pPr>
+              <w:spacing w:after="160"/>
+              <w:rPr>
+                <w:sz w:val="20"/>
+                <w:szCs w:val="20"/>
+              </w:rPr>
+            </w:pPr>
+            <w:r>
+              <w:rPr>
+                <w:sz w:val="20"/>
+                <w:szCs w:val="20"/>
+              </w:rPr>
+              <w:t>20'</w:t>
+            </w:r>
+          </w:p>
+        </w:tc>
+        <w:tc>
+          <w:tcPr>
+            <w:tcW w:w="0" w:type="auto"/>
+            <w:hideMark/>
+          </w:tcPr>
+          <w:p>
+            <w:pPr>
+              <w:spacing w:after="160"/>
+              <w:rPr>
+                <w:sz w:val="20"/>
+                <w:szCs w:val="20"/>
+              </w:rPr>
+            </w:pPr>
+            <w:r>
+              <w:rPr>
+                <w:sz w:val="20"/>
+                <w:szCs w:val="20"/>
+              </w:rPr>
+              <w:t>0</w:t>
+            </w:r>
+          </w:p>
+        </w:tc>
+        <w:tc>
+          <w:tcPr>
+            <w:tcW w:w="0" w:type="auto"/>
+            <w:hideMark/>
+          </w:tcPr>
+          <w:p>
+            <w:pPr>
+              <w:spacing w:after="160"/>
+              <w:rPr>
+                <w:sz w:val="20"/>
+                <w:szCs w:val="20"/>
+              </w:rPr>
+            </w:pPr>
+            <w:r>
+              <w:rPr>
+                <w:sz w:val="20"/>
+                <w:szCs w:val="20"/>
+              </w:rPr>
+              <w:t>Waste Motion, không phải WT</w:t>
+            </w:r>
+          </w:p>
+        </w:tc>
+      </w:tr>
+      <w:tr>
+        <w:tc>
+          <w:tcPr>
+            <w:tcW w:w="0" w:type="auto"/>
+            <w:hideMark/>
+          </w:tcPr>
+          <w:p>
+            <w:pPr>
+              <w:spacing w:after="160"/>
+              <w:rPr>
+                <w:sz w:val="20"/>
+                <w:szCs w:val="20"/>
+              </w:rPr>
+            </w:pPr>
+            <w:r>
+              <w:rPr>
+                <w:i/>
+                <w:iCs/>
+                <w:sz w:val="20"/>
+                <w:szCs w:val="20"/>
+              </w:rPr>
+              <w:t>(12→13)</w:t>
+            </w:r>
+          </w:p>
+        </w:tc>
+        <w:tc>
+          <w:tcPr>
+            <w:tcW w:w="0" w:type="auto"/>
+            <w:hideMark/>
+          </w:tcPr>
+          <w:p>
+            <w:pPr>
+              <w:spacing w:after="160"/>
+              <w:rPr>
+                <w:sz w:val="20"/>
+                <w:szCs w:val="20"/>
+              </w:rPr>
+            </w:pPr>
+            <w:r>
+              <w:rPr>
+                <w:sz w:val="20"/>
+                <w:szCs w:val="20"/>
+              </w:rPr>
+              <w:t xml:space="preserve">Vận chuyển/bàn giao đến bưu </w:t>
+            </w:r>
+            <w:r>
+              <w:rPr>
+                <w:sz w:val="20"/>
+                <w:szCs w:val="20"/>
+              </w:rPr>
+              <w:lastRenderedPageBreak/>
+              <w:t>cục phát khu vực</w:t>
+            </w:r>
+          </w:p>
+        </w:tc>
+        <w:tc>
+          <w:tcPr>
+            <w:tcW w:w="0" w:type="auto"/>
+            <w:hideMark/>
+          </w:tcPr>
+          <w:p>
+            <w:pPr>
+              <w:spacing w:after="160"/>
+              <w:rPr>
+                <w:sz w:val="20"/>
+                <w:szCs w:val="20"/>
+              </w:rPr>
+            </w:pPr>
+            <w:r>
+              <w:rPr>
+                <w:sz w:val="20"/>
+                <w:szCs w:val="20"/>
+              </w:rPr>
+              <w:lastRenderedPageBreak/>
+              <w:t>—</w:t>
+            </w:r>
+          </w:p>
+        </w:tc>
+        <w:tc>
+          <w:tcPr>
+            <w:tcW w:w="0" w:type="auto"/>
+            <w:hideMark/>
+          </w:tcPr>
+          <w:p>
+            <w:pPr>
+              <w:spacing w:after="160"/>
+              <w:rPr>
+                <w:sz w:val="20"/>
+                <w:szCs w:val="20"/>
+              </w:rPr>
+            </w:pPr>
+            <w:r>
+              <w:rPr>
+                <w:sz w:val="20"/>
+                <w:szCs w:val="20"/>
+              </w:rPr>
+              <w:t>—</w:t>
+            </w:r>
+          </w:p>
+        </w:tc>
+        <w:tc>
+          <w:tcPr>
+            <w:tcW w:w="0" w:type="auto"/>
+            <w:hideMark/>
+          </w:tcPr>
+          <w:p>
+            <w:pPr>
+              <w:spacing w:after="160"/>
+              <w:rPr>
+                <w:sz w:val="20"/>
+                <w:szCs w:val="20"/>
+              </w:rPr>
+            </w:pPr>
+            <w:r>
+              <w:rPr>
+                <w:b/>
+                <w:bCs/>
+                <w:sz w:val="20"/>
+                <w:szCs w:val="20"/>
+              </w:rPr>
+              <w:t>24h</w:t>
+            </w:r>
+          </w:p>
+        </w:tc>
+        <w:tc>
+          <w:tcPr>
+            <w:tcW w:w="0" w:type="auto"/>
+            <w:hideMark/>
+          </w:tcPr>
+          <w:p>
+            <w:pPr>
+              <w:spacing w:after="160"/>
+              <w:rPr>
+                <w:sz w:val="20"/>
+                <w:szCs w:val="20"/>
+              </w:rPr>
+            </w:pPr>
+            <w:r>
+              <w:rPr>
+                <w:sz w:val="20"/>
+                <w:szCs w:val="20"/>
+              </w:rPr>
+              <w:t xml:space="preserve">SLA nội tỉnh 1–2 ngày, cận dưới. Khoảng chờ </w:t>
+            </w:r>
+            <w:r>
+              <w:rPr>
+                <w:i/>
+                <w:iCs/>
+                <w:sz w:val="20"/>
+                <w:szCs w:val="20"/>
+              </w:rPr>
+              <w:t>giữa</w:t>
+            </w:r>
+            <w:r>
+              <w:rPr>
+                <w:sz w:val="20"/>
+                <w:szCs w:val="20"/>
+              </w:rPr>
+              <w:t xml:space="preserve"> bước 12 và 13</w:t>
+            </w:r>
+          </w:p>
+        </w:tc>
+      </w:tr>
+      <w:tr>
+        <w:tc>
+          <w:tcPr>
+            <w:tcW w:w="0" w:type="auto"/>
+            <w:hideMark/>
+          </w:tcPr>
+          <w:p>
+            <w:pPr>
+              <w:spacing w:after="160"/>
+              <w:rPr>
+                <w:sz w:val="20"/>
+                <w:szCs w:val="20"/>
+              </w:rPr>
+            </w:pPr>
+            <w:r>
+              <w:rPr>
+                <w:sz w:val="20"/>
+                <w:szCs w:val="20"/>
+              </w:rPr>
+              <w:t>13</w:t>
+            </w:r>
+          </w:p>
+        </w:tc>
+        <w:tc>
+          <w:tcPr>
+            <w:tcW w:w="0" w:type="auto"/>
+            <w:hideMark/>
+          </w:tcPr>
+          <w:p>
+            <w:pPr>
+              <w:spacing w:after="160"/>
+              <w:rPr>
+                <w:sz w:val="20"/>
+                <w:szCs w:val="20"/>
+              </w:rPr>
+            </w:pPr>
+            <w:r>
+              <w:rPr>
+                <w:sz w:val="20"/>
+                <w:szCs w:val="20"/>
+              </w:rPr>
+              <w:t>Nhận thông tin đơn &amp; vận chuyển</w:t>
+            </w:r>
+          </w:p>
+        </w:tc>
+        <w:tc>
+          <w:tcPr>
+            <w:tcW w:w="0" w:type="auto"/>
+            <w:hideMark/>
+          </w:tcPr>
+          <w:p>
+            <w:pPr>
+              <w:spacing w:after="160"/>
+              <w:rPr>
+                <w:sz w:val="20"/>
+                <w:szCs w:val="20"/>
+              </w:rPr>
+            </w:pPr>
+            <w:r>
+              <w:rPr>
+                <w:sz w:val="20"/>
+                <w:szCs w:val="20"/>
+              </w:rPr>
+              <w:t>Người Giao Hàng</w:t>
+            </w:r>
+          </w:p>
+        </w:tc>
+        <w:tc>
+          <w:tcPr>
+            <w:tcW w:w="0" w:type="auto"/>
+            <w:hideMark/>
+          </w:tcPr>
+          <w:p>
+            <w:pPr>
+              <w:spacing w:after="160"/>
+              <w:rPr>
+                <w:sz w:val="20"/>
+                <w:szCs w:val="20"/>
+              </w:rPr>
+            </w:pPr>
+            <w:r>
+              <w:rPr>
+                <w:sz w:val="20"/>
+                <w:szCs w:val="20"/>
+              </w:rPr>
+              <w:t>2'</w:t>
+            </w:r>
+          </w:p>
+        </w:tc>
+        <w:tc>
+          <w:tcPr>
+            <w:tcW w:w="0" w:type="auto"/>
+            <w:hideMark/>
+          </w:tcPr>
+          <w:p>
+            <w:pPr>
+              <w:spacing w:after="160"/>
+              <w:rPr>
+                <w:sz w:val="20"/>
+                <w:szCs w:val="20"/>
+              </w:rPr>
+            </w:pPr>
+            <w:r>
+              <w:rPr>
+                <w:sz w:val="20"/>
+                <w:szCs w:val="20"/>
+              </w:rPr>
+              <w:t>0</w:t>
+            </w:r>
+          </w:p>
+        </w:tc>
+        <w:tc>
+          <w:tcPr>
+            <w:tcW w:w="0" w:type="auto"/>
+            <w:hideMark/>
+          </w:tcPr>
+          <w:p>
+            <w:pPr>
+              <w:spacing w:after="160"/>
+              <w:rPr>
+                <w:sz w:val="20"/>
+                <w:szCs w:val="20"/>
+              </w:rPr>
+            </w:pPr>
+            <w:r>
+              <w:rPr>
+                <w:sz w:val="20"/>
+                <w:szCs w:val="20"/>
+              </w:rPr>
+              <w:t>PT=2+30+2+1,65+2, khớp 5 bước 13–17</w:t>
+            </w:r>
+          </w:p>
+        </w:tc>
+      </w:tr>
+      <w:tr>
+        <w:tc>
+          <w:tcPr>
+            <w:tcW w:w="0" w:type="auto"/>
+            <w:hideMark/>
+          </w:tcPr>
+          <w:p>
+            <w:pPr>
+              <w:spacing w:after="160"/>
+              <w:rPr>
+                <w:sz w:val="20"/>
+                <w:szCs w:val="20"/>
+              </w:rPr>
+            </w:pPr>
+            <w:r>
+              <w:rPr>
+                <w:sz w:val="20"/>
+                <w:szCs w:val="20"/>
+              </w:rPr>
+              <w:t>14</w:t>
+            </w:r>
+          </w:p>
+        </w:tc>
+        <w:tc>
+          <w:tcPr>
+            <w:tcW w:w="0" w:type="auto"/>
+            <w:hideMark/>
+          </w:tcPr>
+          <w:p>
+            <w:pPr>
+              <w:spacing w:after="160"/>
+              <w:rPr>
+                <w:sz w:val="20"/>
+                <w:szCs w:val="20"/>
+              </w:rPr>
+            </w:pPr>
+            <w:r>
+              <w:rPr>
+                <w:sz w:val="20"/>
+                <w:szCs w:val="20"/>
+              </w:rPr>
+              <w:t>Giao đơn cho người nhận</w:t>
+            </w:r>
+          </w:p>
+        </w:tc>
+        <w:tc>
+          <w:tcPr>
+            <w:tcW w:w="0" w:type="auto"/>
+            <w:hideMark/>
+          </w:tcPr>
+          <w:p>
+            <w:pPr>
+              <w:spacing w:after="160"/>
+              <w:rPr>
+                <w:sz w:val="20"/>
+                <w:szCs w:val="20"/>
+              </w:rPr>
+            </w:pPr>
+            <w:r>
+              <w:rPr>
+                <w:sz w:val="20"/>
+                <w:szCs w:val="20"/>
+              </w:rPr>
+              <w:t>Người Giao Hàng</w:t>
+            </w:r>
+          </w:p>
+        </w:tc>
+        <w:tc>
+          <w:tcPr>
+            <w:tcW w:w="0" w:type="auto"/>
+            <w:hideMark/>
+          </w:tcPr>
+          <w:p>
+            <w:pPr>
+              <w:spacing w:after="160"/>
+              <w:rPr>
+                <w:sz w:val="20"/>
+                <w:szCs w:val="20"/>
+              </w:rPr>
+            </w:pPr>
+            <w:r>
+              <w:rPr>
+                <w:sz w:val="20"/>
+                <w:szCs w:val="20"/>
+              </w:rPr>
+              <w:t>30'</w:t>
+            </w:r>
+          </w:p>
+        </w:tc>
+        <w:tc>
+          <w:tcPr>
+            <w:tcW w:w="0" w:type="auto"/>
+            <w:hideMark/>
+          </w:tcPr>
+          <w:p>
+            <w:pPr>
+              <w:spacing w:after="160"/>
+              <w:rPr>
+                <w:sz w:val="20"/>
+                <w:szCs w:val="20"/>
+              </w:rPr>
+            </w:pPr>
+            <w:r>
+              <w:rPr>
+                <w:sz w:val="20"/>
+                <w:szCs w:val="20"/>
+              </w:rPr>
+              <w:t>0</w:t>
+            </w:r>
+          </w:p>
+        </w:tc>
+        <w:tc>
+          <w:tcPr>
+            <w:tcW w:w="0" w:type="auto"/>
+            <w:hideMark/>
+          </w:tcPr>
+          <w:p>
+            <w:pPr>
+              <w:spacing w:after="160"/>
+              <w:rPr>
+                <w:sz w:val="20"/>
+                <w:szCs w:val="20"/>
+              </w:rPr>
+            </w:pPr>
+            <w:r>
+              <w:rPr>
+                <w:sz w:val="20"/>
+                <w:szCs w:val="20"/>
+              </w:rPr>
+              <w:t>nt</w:t>
+            </w:r>
+          </w:p>
+        </w:tc>
+      </w:tr>
+      <w:tr>
+        <w:tc>
+          <w:tcPr>
+            <w:tcW w:w="0" w:type="auto"/>
+            <w:hideMark/>
+          </w:tcPr>
+          <w:p>
+            <w:pPr>
+              <w:spacing w:after="160"/>
+              <w:rPr>
+                <w:sz w:val="20"/>
+                <w:szCs w:val="20"/>
+              </w:rPr>
+            </w:pPr>
+            <w:r>
+              <w:rPr>
+                <w:sz w:val="20"/>
+                <w:szCs w:val="20"/>
+              </w:rPr>
+              <w:t>15</w:t>
+            </w:r>
+          </w:p>
+        </w:tc>
+        <w:tc>
+          <w:tcPr>
+            <w:tcW w:w="0" w:type="auto"/>
+            <w:hideMark/>
+          </w:tcPr>
+          <w:p>
+            <w:pPr>
+              <w:spacing w:after="160"/>
+              <w:rPr>
+                <w:sz w:val="20"/>
+                <w:szCs w:val="20"/>
+              </w:rPr>
+            </w:pPr>
+            <w:r>
+              <w:rPr>
+                <w:sz w:val="20"/>
+                <w:szCs w:val="20"/>
+              </w:rPr>
+              <w:t>Nhận &amp; kiểm tra đơn hàng (Gateway)</w:t>
+            </w:r>
+          </w:p>
+        </w:tc>
+        <w:tc>
+          <w:tcPr>
+            <w:tcW w:w="0" w:type="auto"/>
+            <w:hideMark/>
+          </w:tcPr>
+          <w:p>
+            <w:pPr>
+              <w:spacing w:after="160"/>
+              <w:rPr>
+                <w:sz w:val="20"/>
+                <w:szCs w:val="20"/>
+              </w:rPr>
+            </w:pPr>
+            <w:r>
+              <w:rPr>
+                <w:sz w:val="20"/>
+                <w:szCs w:val="20"/>
+              </w:rPr>
+              <w:t>Người nhận</w:t>
+            </w:r>
+          </w:p>
+        </w:tc>
+        <w:tc>
+          <w:tcPr>
+            <w:tcW w:w="0" w:type="auto"/>
+            <w:hideMark/>
+          </w:tcPr>
+          <w:p>
+            <w:pPr>
+              <w:spacing w:after="160"/>
+              <w:rPr>
+                <w:sz w:val="20"/>
+                <w:szCs w:val="20"/>
+              </w:rPr>
+            </w:pPr>
+            <w:r>
+              <w:rPr>
+                <w:sz w:val="20"/>
+                <w:szCs w:val="20"/>
+              </w:rPr>
+              <w:t>2'*</w:t>
+            </w:r>
+          </w:p>
+        </w:tc>
+        <w:tc>
+          <w:tcPr>
+            <w:tcW w:w="0" w:type="auto"/>
+            <w:hideMark/>
+          </w:tcPr>
+          <w:p>
+            <w:pPr>
+              <w:spacing w:after="160"/>
+              <w:rPr>
+                <w:sz w:val="20"/>
+                <w:szCs w:val="20"/>
+              </w:rPr>
+            </w:pPr>
+            <w:r>
+              <w:rPr>
+                <w:b/>
+                <w:bCs/>
+                <w:sz w:val="20"/>
+                <w:szCs w:val="20"/>
+              </w:rPr>
+              <w:t>48h</w:t>
+            </w:r>
+            <w:r>
+              <w:rPr>
+                <w:sz w:val="20"/>
+                <w:szCs w:val="20"/>
+              </w:rPr>
+              <w:t xml:space="preserve"> (nhánh ~8%)</w:t>
+            </w:r>
+          </w:p>
+        </w:tc>
+        <w:tc>
+          <w:tcPr>
+            <w:tcW w:w="0" w:type="auto"/>
+            <w:hideMark/>
+          </w:tcPr>
+          <w:p>
+            <w:pPr>
+              <w:spacing w:after="160"/>
+              <w:rPr>
+                <w:sz w:val="20"/>
+                <w:szCs w:val="20"/>
+              </w:rPr>
+            </w:pPr>
+            <w:r>
+              <w:rPr>
+                <w:sz w:val="20"/>
+                <w:szCs w:val="20"/>
+              </w:rPr>
+              <w:t>*PT ghi nhận là thời gian tương tác lúc giao (từ phía Người Giao Hàng); PT cá nhân người nhận không tính. WT chỉ phát sinh nếu rơi nhánh 15.2</w:t>
+            </w:r>
+          </w:p>
+        </w:tc>
+      </w:tr>
+      <w:tr>
+        <w:tc>
+          <w:tcPr>
+            <w:tcW w:w="0" w:type="auto"/>
+            <w:hideMark/>
+          </w:tcPr>
+          <w:p>
+            <w:pPr>
+              <w:spacing w:after="160"/>
+              <w:rPr>
+                <w:sz w:val="20"/>
+                <w:szCs w:val="20"/>
+              </w:rPr>
+            </w:pPr>
+            <w:r>
+              <w:rPr>
+                <w:sz w:val="20"/>
+                <w:szCs w:val="20"/>
+              </w:rPr>
+              <w:t>16 (16.1–16.3)</w:t>
+            </w:r>
+          </w:p>
+        </w:tc>
+        <w:tc>
+          <w:tcPr>
+            <w:tcW w:w="0" w:type="auto"/>
+            <w:hideMark/>
+          </w:tcPr>
+          <w:p>
+            <w:pPr>
+              <w:spacing w:after="160"/>
+              <w:rPr>
+                <w:sz w:val="20"/>
+                <w:szCs w:val="20"/>
+              </w:rPr>
+            </w:pPr>
+            <w:r>
+              <w:rPr>
+                <w:sz w:val="20"/>
+                <w:szCs w:val="20"/>
+              </w:rPr>
+              <w:t>Thu tiền COD (Gateway hình thức TT)</w:t>
+            </w:r>
+          </w:p>
+        </w:tc>
+        <w:tc>
+          <w:tcPr>
+            <w:tcW w:w="0" w:type="auto"/>
+            <w:hideMark/>
+          </w:tcPr>
+          <w:p>
+            <w:pPr>
+              <w:spacing w:after="160"/>
+              <w:rPr>
+                <w:sz w:val="20"/>
+                <w:szCs w:val="20"/>
+              </w:rPr>
+            </w:pPr>
+            <w:r>
+              <w:rPr>
+                <w:sz w:val="20"/>
+                <w:szCs w:val="20"/>
+              </w:rPr>
+              <w:t>Người Giao Hàng</w:t>
+            </w:r>
+          </w:p>
+        </w:tc>
+        <w:tc>
+          <w:tcPr>
+            <w:tcW w:w="0" w:type="auto"/>
+            <w:hideMark/>
+          </w:tcPr>
+          <w:p>
+            <w:pPr>
+              <w:spacing w:after="160"/>
+              <w:rPr>
+                <w:sz w:val="20"/>
+                <w:szCs w:val="20"/>
+              </w:rPr>
+            </w:pPr>
+            <w:r>
+              <w:rPr>
+                <w:sz w:val="20"/>
+                <w:szCs w:val="20"/>
+              </w:rPr>
+              <w:t>1,65'</w:t>
+            </w:r>
+          </w:p>
+        </w:tc>
+        <w:tc>
+          <w:tcPr>
+            <w:tcW w:w="0" w:type="auto"/>
+            <w:hideMark/>
+          </w:tcPr>
+          <w:p>
+            <w:pPr>
+              <w:spacing w:after="160"/>
+              <w:rPr>
+                <w:sz w:val="20"/>
+                <w:szCs w:val="20"/>
+              </w:rPr>
+            </w:pPr>
+            <w:r>
+              <w:rPr>
+                <w:sz w:val="20"/>
+                <w:szCs w:val="20"/>
+              </w:rPr>
+              <w:t>0</w:t>
+            </w:r>
+          </w:p>
+        </w:tc>
+        <w:tc>
+          <w:tcPr>
+            <w:tcW w:w="0" w:type="auto"/>
+            <w:hideMark/>
+          </w:tcPr>
+          <w:p>
+            <w:pPr>
+              <w:spacing w:after="160"/>
+              <w:rPr>
+                <w:sz w:val="20"/>
+                <w:szCs w:val="20"/>
+              </w:rPr>
+            </w:pPr>
+            <w:r>
+              <w:rPr>
+                <w:sz w:val="20"/>
+                <w:szCs w:val="20"/>
+              </w:rPr>
+              <w:t>Kỳ vọng: 35%×banking(1')+65%×tiền mặt(2')</w:t>
+            </w:r>
+          </w:p>
+        </w:tc>
+      </w:tr>
+      <w:tr>
+        <w:tc>
+          <w:tcPr>
+            <w:tcW w:w="0" w:type="auto"/>
+            <w:hideMark/>
+          </w:tcPr>
+          <w:p>
+            <w:pPr>
+              <w:spacing w:after="160"/>
+              <w:rPr>
+                <w:sz w:val="20"/>
+                <w:szCs w:val="20"/>
+              </w:rPr>
+            </w:pPr>
+            <w:r>
+              <w:rPr>
+                <w:sz w:val="20"/>
+                <w:szCs w:val="20"/>
+              </w:rPr>
+              <w:t>17</w:t>
+            </w:r>
+          </w:p>
+        </w:tc>
+        <w:tc>
+          <w:tcPr>
+            <w:tcW w:w="0" w:type="auto"/>
+            <w:hideMark/>
+          </w:tcPr>
+          <w:p>
+            <w:pPr>
+              <w:spacing w:after="160"/>
+              <w:rPr>
+                <w:sz w:val="20"/>
+                <w:szCs w:val="20"/>
+              </w:rPr>
+            </w:pPr>
+            <w:r>
+              <w:rPr>
+                <w:sz w:val="20"/>
+                <w:szCs w:val="20"/>
+              </w:rPr>
+              <w:t>Hoàn tất chứng từ &amp; phí COD</w:t>
+            </w:r>
+          </w:p>
+        </w:tc>
+        <w:tc>
+          <w:tcPr>
+            <w:tcW w:w="0" w:type="auto"/>
+            <w:hideMark/>
+          </w:tcPr>
+          <w:p>
+            <w:pPr>
+              <w:spacing w:after="160"/>
+              <w:rPr>
+                <w:sz w:val="20"/>
+                <w:szCs w:val="20"/>
+              </w:rPr>
+            </w:pPr>
+            <w:r>
+              <w:rPr>
+                <w:sz w:val="20"/>
+                <w:szCs w:val="20"/>
+              </w:rPr>
+              <w:t>Người Giao Hàng</w:t>
+            </w:r>
+          </w:p>
+        </w:tc>
+        <w:tc>
+          <w:tcPr>
+            <w:tcW w:w="0" w:type="auto"/>
+            <w:hideMark/>
+          </w:tcPr>
+          <w:p>
+            <w:pPr>
+              <w:spacing w:after="160"/>
+              <w:rPr>
+                <w:sz w:val="20"/>
+                <w:szCs w:val="20"/>
+              </w:rPr>
+            </w:pPr>
+            <w:r>
+              <w:rPr>
+                <w:sz w:val="20"/>
+                <w:szCs w:val="20"/>
+              </w:rPr>
+              <w:t>2'</w:t>
+            </w:r>
+          </w:p>
+        </w:tc>
+        <w:tc>
+          <w:tcPr>
+            <w:tcW w:w="0" w:type="auto"/>
+            <w:hideMark/>
+          </w:tcPr>
+          <w:p>
+            <w:pPr>
+              <w:spacing w:after="160"/>
+              <w:rPr>
+                <w:sz w:val="20"/>
+                <w:szCs w:val="20"/>
+              </w:rPr>
+            </w:pPr>
+            <w:r>
+              <w:rPr>
+                <w:sz w:val="20"/>
+                <w:szCs w:val="20"/>
+              </w:rPr>
+              <w:t>0</w:t>
+            </w:r>
+          </w:p>
+        </w:tc>
+        <w:tc>
+          <w:tcPr>
+            <w:tcW w:w="0" w:type="auto"/>
+            <w:hideMark/>
+          </w:tcPr>
+          <w:p>
+            <w:pPr>
+              <w:spacing w:after="160"/>
+              <w:rPr>
+                <w:sz w:val="20"/>
+                <w:szCs w:val="20"/>
+              </w:rPr>
+            </w:pPr>
+            <w:r>
+              <w:rPr>
+                <w:sz w:val="20"/>
+                <w:szCs w:val="20"/>
+              </w:rPr>
+              <w:t>Số hạng cuối</w:t>
+            </w:r>
+          </w:p>
+        </w:tc>
+      </w:tr>
+      <w:tr>
+        <w:tc>
+          <w:tcPr>
+            <w:tcW w:w="0" w:type="auto"/>
+            <w:hideMark/>
+          </w:tcPr>
+          <w:p>
+            <w:pPr>
+              <w:spacing w:after="160"/>
+              <w:rPr>
+                <w:sz w:val="20"/>
+                <w:szCs w:val="20"/>
+              </w:rPr>
+            </w:pPr>
+            <w:r>
+              <w:rPr>
+                <w:sz w:val="20"/>
+                <w:szCs w:val="20"/>
+              </w:rPr>
+              <w:t>18</w:t>
+            </w:r>
+          </w:p>
+        </w:tc>
+        <w:tc>
+          <w:tcPr>
+            <w:tcW w:w="0" w:type="auto"/>
+            <w:hideMark/>
+          </w:tcPr>
+          <w:p>
+            <w:pPr>
+              <w:spacing w:after="160"/>
+              <w:rPr>
+                <w:sz w:val="20"/>
+                <w:szCs w:val="20"/>
+              </w:rPr>
+            </w:pPr>
+            <w:r>
+              <w:rPr>
+                <w:sz w:val="20"/>
+                <w:szCs w:val="20"/>
+              </w:rPr>
+              <w:t>Tiếp nhận chứng từ &amp; phí COD (tiền mặt)</w:t>
+            </w:r>
+          </w:p>
+        </w:tc>
+        <w:tc>
+          <w:tcPr>
+            <w:tcW w:w="0" w:type="auto"/>
+            <w:hideMark/>
+          </w:tcPr>
+          <w:p>
+            <w:pPr>
+              <w:spacing w:after="160"/>
+              <w:rPr>
+                <w:sz w:val="20"/>
+                <w:szCs w:val="20"/>
+              </w:rPr>
+            </w:pPr>
+            <w:r>
+              <w:rPr>
+                <w:sz w:val="20"/>
+                <w:szCs w:val="20"/>
+              </w:rPr>
+              <w:t>Bưu cục</w:t>
+            </w:r>
+          </w:p>
+        </w:tc>
+        <w:tc>
+          <w:tcPr>
+            <w:tcW w:w="0" w:type="auto"/>
+            <w:hideMark/>
+          </w:tcPr>
+          <w:p>
+            <w:pPr>
+              <w:spacing w:after="160"/>
+              <w:rPr>
+                <w:sz w:val="20"/>
+                <w:szCs w:val="20"/>
+              </w:rPr>
+            </w:pPr>
+            <w:r>
+              <w:rPr>
+                <w:sz w:val="20"/>
+                <w:szCs w:val="20"/>
+              </w:rPr>
+              <w:t>1,95'</w:t>
+            </w:r>
+          </w:p>
+        </w:tc>
+        <w:tc>
+          <w:tcPr>
+            <w:tcW w:w="0" w:type="auto"/>
+            <w:hideMark/>
+          </w:tcPr>
+          <w:p>
+            <w:pPr>
+              <w:spacing w:after="160"/>
+              <w:rPr>
+                <w:sz w:val="20"/>
+                <w:szCs w:val="20"/>
+              </w:rPr>
+            </w:pPr>
+            <w:r>
+              <w:rPr>
+                <w:sz w:val="20"/>
+                <w:szCs w:val="20"/>
+              </w:rPr>
+              <w:t>—</w:t>
+            </w:r>
+          </w:p>
+        </w:tc>
+        <w:tc>
+          <w:tcPr>
+            <w:tcW w:w="0" w:type="auto"/>
+            <w:hideMark/>
+          </w:tcPr>
+          <w:p>
+            <w:pPr>
+              <w:spacing w:after="160"/>
+              <w:rPr>
+                <w:sz w:val="20"/>
+                <w:szCs w:val="20"/>
+              </w:rPr>
+            </w:pPr>
+            <w:r>
+              <w:rPr>
+                <w:sz w:val="20"/>
+                <w:szCs w:val="20"/>
+              </w:rPr>
+              <w:t xml:space="preserve">=3'×65% </w:t>
+            </w:r>
+            <w:r>
+              <w:rPr>
+                <w:i/>
+                <w:iCs/>
+                <w:sz w:val="20"/>
+                <w:szCs w:val="20"/>
+              </w:rPr>
+              <w:t>(chỉ áp dụng khi thu tiền mặt)</w:t>
+            </w:r>
+            <w:r>
+              <w:rPr>
+                <w:sz w:val="20"/>
+                <w:szCs w:val="20"/>
+              </w:rPr>
+              <w:t xml:space="preserve"> </w:t>
+            </w:r>
+            <w:r>
+              <w:rPr>
+                <w:i/>
+                <w:iCs/>
+                <w:sz w:val="20"/>
+                <w:szCs w:val="20"/>
+              </w:rPr>
+              <w:t>(giả định)</w:t>
+            </w:r>
+          </w:p>
+        </w:tc>
+      </w:tr>
+      <w:tr>
+        <w:tc>
+          <w:tcPr>
+            <w:tcW w:w="0" w:type="auto"/>
+            <w:hideMark/>
+          </w:tcPr>
+          <w:p>
+            <w:pPr>
+              <w:spacing w:after="160"/>
+              <w:rPr>
+                <w:sz w:val="20"/>
+                <w:szCs w:val="20"/>
+              </w:rPr>
+            </w:pPr>
+            <w:r>
+              <w:rPr>
+                <w:sz w:val="20"/>
+                <w:szCs w:val="20"/>
+              </w:rPr>
+              <w:t>19</w:t>
+            </w:r>
+          </w:p>
+        </w:tc>
+        <w:tc>
+          <w:tcPr>
+            <w:tcW w:w="0" w:type="auto"/>
+            <w:hideMark/>
+          </w:tcPr>
+          <w:p>
+            <w:pPr>
+              <w:spacing w:after="160"/>
+              <w:rPr>
+                <w:sz w:val="20"/>
+                <w:szCs w:val="20"/>
+              </w:rPr>
+            </w:pPr>
+            <w:r>
+              <w:rPr>
+                <w:sz w:val="20"/>
+                <w:szCs w:val="20"/>
+              </w:rPr>
+              <w:t>Cập nhật kết quả giao hàng (Gateway)</w:t>
+            </w:r>
+          </w:p>
+        </w:tc>
+        <w:tc>
+          <w:tcPr>
+            <w:tcW w:w="0" w:type="auto"/>
+            <w:hideMark/>
+          </w:tcPr>
+          <w:p>
+            <w:pPr>
+              <w:spacing w:after="160"/>
+              <w:rPr>
+                <w:sz w:val="20"/>
+                <w:szCs w:val="20"/>
+              </w:rPr>
+            </w:pPr>
+            <w:r>
+              <w:rPr>
+                <w:sz w:val="20"/>
+                <w:szCs w:val="20"/>
+              </w:rPr>
+              <w:t>Bưu cục</w:t>
+            </w:r>
+          </w:p>
+        </w:tc>
+        <w:tc>
+          <w:tcPr>
+            <w:tcW w:w="0" w:type="auto"/>
+            <w:hideMark/>
+          </w:tcPr>
+          <w:p>
+            <w:pPr>
+              <w:spacing w:after="160"/>
+              <w:rPr>
+                <w:sz w:val="20"/>
+                <w:szCs w:val="20"/>
+              </w:rPr>
+            </w:pPr>
+            <w:r>
+              <w:rPr>
+                <w:sz w:val="20"/>
+                <w:szCs w:val="20"/>
+              </w:rPr>
+              <w:t>4'</w:t>
+            </w:r>
+          </w:p>
+        </w:tc>
+        <w:tc>
+          <w:tcPr>
+            <w:tcW w:w="0" w:type="auto"/>
+            <w:hideMark/>
+          </w:tcPr>
+          <w:p>
+            <w:pPr>
+              <w:spacing w:after="160"/>
+              <w:rPr>
+                <w:sz w:val="20"/>
+                <w:szCs w:val="20"/>
+              </w:rPr>
+            </w:pPr>
+            <w:r>
+              <w:rPr>
+                <w:b/>
+                <w:bCs/>
+                <w:sz w:val="20"/>
+                <w:szCs w:val="20"/>
+              </w:rPr>
+              <w:t>24h</w:t>
+            </w:r>
+          </w:p>
+        </w:tc>
+        <w:tc>
+          <w:tcPr>
+            <w:tcW w:w="0" w:type="auto"/>
+            <w:hideMark/>
+          </w:tcPr>
+          <w:p>
+            <w:pPr>
+              <w:spacing w:after="160"/>
+              <w:rPr>
+                <w:sz w:val="20"/>
+                <w:szCs w:val="20"/>
+              </w:rPr>
+            </w:pPr>
+            <w:r>
+              <w:rPr>
+                <w:sz w:val="20"/>
+                <w:szCs w:val="20"/>
+              </w:rPr>
+              <w:t xml:space="preserve">=2+2. WT chờ nộp phí COD &amp; chứng từ cho kế toán </w:t>
+            </w:r>
+            <w:r>
+              <w:rPr>
+                <w:i/>
+                <w:iCs/>
+                <w:sz w:val="20"/>
+                <w:szCs w:val="20"/>
+              </w:rPr>
+              <w:t>(giả định phân bổ)</w:t>
+            </w:r>
+          </w:p>
+        </w:tc>
+      </w:tr>
+      <w:tr>
+        <w:tc>
+          <w:tcPr>
+            <w:tcW w:w="0" w:type="auto"/>
+            <w:hideMark/>
+          </w:tcPr>
+          <w:p>
+            <w:pPr>
+              <w:spacing w:after="160"/>
+              <w:rPr>
+                <w:sz w:val="20"/>
+                <w:szCs w:val="20"/>
+              </w:rPr>
+            </w:pPr>
+            <w:r>
+              <w:rPr>
+                <w:sz w:val="20"/>
+                <w:szCs w:val="20"/>
+              </w:rPr>
+              <w:t>20</w:t>
+            </w:r>
+          </w:p>
+        </w:tc>
+        <w:tc>
+          <w:tcPr>
+            <w:tcW w:w="0" w:type="auto"/>
+            <w:hideMark/>
+          </w:tcPr>
+          <w:p>
+            <w:pPr>
+              <w:spacing w:after="160"/>
+              <w:rPr>
+                <w:sz w:val="20"/>
+                <w:szCs w:val="20"/>
+              </w:rPr>
+            </w:pPr>
+            <w:r>
+              <w:rPr>
+                <w:sz w:val="20"/>
+                <w:szCs w:val="20"/>
+              </w:rPr>
+              <w:t>Xác nhận đơn thông tin</w:t>
+            </w:r>
+          </w:p>
+        </w:tc>
+        <w:tc>
+          <w:tcPr>
+            <w:tcW w:w="0" w:type="auto"/>
+            <w:hideMark/>
+          </w:tcPr>
+          <w:p>
+            <w:pPr>
+              <w:spacing w:after="160"/>
+              <w:rPr>
+                <w:sz w:val="20"/>
+                <w:szCs w:val="20"/>
+              </w:rPr>
+            </w:pPr>
+            <w:r>
+              <w:rPr>
+                <w:sz w:val="20"/>
+                <w:szCs w:val="20"/>
+              </w:rPr>
+              <w:t>Kế toán/Đối soát</w:t>
+            </w:r>
+          </w:p>
+        </w:tc>
+        <w:tc>
+          <w:tcPr>
+            <w:tcW w:w="0" w:type="auto"/>
+            <w:hideMark/>
+          </w:tcPr>
+          <w:p>
+            <w:pPr>
+              <w:spacing w:after="160"/>
+              <w:rPr>
+                <w:sz w:val="20"/>
+                <w:szCs w:val="20"/>
+              </w:rPr>
+            </w:pPr>
+            <w:r>
+              <w:rPr>
+                <w:sz w:val="20"/>
+                <w:szCs w:val="20"/>
+              </w:rPr>
+              <w:t>5'</w:t>
+            </w:r>
+          </w:p>
+        </w:tc>
+        <w:tc>
+          <w:tcPr>
+            <w:tcW w:w="0" w:type="auto"/>
+            <w:hideMark/>
+          </w:tcPr>
+          <w:p>
+            <w:pPr>
+              <w:spacing w:after="160"/>
+              <w:rPr>
+                <w:sz w:val="20"/>
+                <w:szCs w:val="20"/>
+              </w:rPr>
+            </w:pPr>
+            <w:r>
+              <w:rPr>
+                <w:sz w:val="20"/>
+                <w:szCs w:val="20"/>
+              </w:rPr>
+              <w:t>—</w:t>
+            </w:r>
+          </w:p>
+        </w:tc>
+        <w:tc>
+          <w:tcPr>
+            <w:tcW w:w="0" w:type="auto"/>
+            <w:hideMark/>
+          </w:tcPr>
+          <w:p>
+            <w:pPr>
+              <w:spacing w:after="160"/>
+              <w:rPr>
+                <w:sz w:val="20"/>
+                <w:szCs w:val="20"/>
+              </w:rPr>
+            </w:pPr>
+            <w:r>
+              <w:rPr>
+                <w:sz w:val="20"/>
+                <w:szCs w:val="20"/>
+              </w:rPr>
+              <w:t>PT=5+3+5+4+5, khớp đúng 5 bước 20–21</w:t>
+            </w:r>
+          </w:p>
+        </w:tc>
+      </w:tr>
+      <w:tr>
+        <w:tc>
+          <w:tcPr>
+            <w:tcW w:w="0" w:type="auto"/>
+            <w:hideMark/>
+          </w:tcPr>
+          <w:p>
+            <w:pPr>
+              <w:spacing w:after="160"/>
+              <w:rPr>
+                <w:sz w:val="20"/>
+                <w:szCs w:val="20"/>
+              </w:rPr>
+            </w:pPr>
+            <w:r>
+              <w:rPr>
+                <w:sz w:val="20"/>
+                <w:szCs w:val="20"/>
+              </w:rPr>
+              <w:t>20.1</w:t>
+            </w:r>
+          </w:p>
+        </w:tc>
+        <w:tc>
+          <w:tcPr>
+            <w:tcW w:w="0" w:type="auto"/>
+            <w:hideMark/>
+          </w:tcPr>
+          <w:p>
+            <w:pPr>
+              <w:spacing w:after="160"/>
+              <w:rPr>
+                <w:sz w:val="20"/>
+                <w:szCs w:val="20"/>
+              </w:rPr>
+            </w:pPr>
+            <w:r>
+              <w:rPr>
+                <w:sz w:val="20"/>
+                <w:szCs w:val="20"/>
+              </w:rPr>
+              <w:t>Kiểm soát dữ liệu cần đối soát</w:t>
+            </w:r>
+          </w:p>
+        </w:tc>
+        <w:tc>
+          <w:tcPr>
+            <w:tcW w:w="0" w:type="auto"/>
+            <w:hideMark/>
+          </w:tcPr>
+          <w:p>
+            <w:pPr>
+              <w:spacing w:after="160"/>
+              <w:rPr>
+                <w:sz w:val="20"/>
+                <w:szCs w:val="20"/>
+              </w:rPr>
+            </w:pPr>
+            <w:r>
+              <w:rPr>
+                <w:sz w:val="20"/>
+                <w:szCs w:val="20"/>
+              </w:rPr>
+              <w:t>Kế toán/Đối soát</w:t>
+            </w:r>
+          </w:p>
+        </w:tc>
+        <w:tc>
+          <w:tcPr>
+            <w:tcW w:w="0" w:type="auto"/>
+            <w:hideMark/>
+          </w:tcPr>
+          <w:p>
+            <w:pPr>
+              <w:spacing w:after="160"/>
+              <w:rPr>
+                <w:sz w:val="20"/>
+                <w:szCs w:val="20"/>
+              </w:rPr>
+            </w:pPr>
+            <w:r>
+              <w:rPr>
+                <w:sz w:val="20"/>
+                <w:szCs w:val="20"/>
+              </w:rPr>
+              <w:t>3'</w:t>
+            </w:r>
+          </w:p>
+        </w:tc>
+        <w:tc>
+          <w:tcPr>
+            <w:tcW w:w="0" w:type="auto"/>
+            <w:hideMark/>
+          </w:tcPr>
+          <w:p>
+            <w:pPr>
+              <w:spacing w:after="160"/>
+              <w:rPr>
+                <w:sz w:val="20"/>
+                <w:szCs w:val="20"/>
+              </w:rPr>
+            </w:pPr>
+            <w:r>
+              <w:rPr>
+                <w:sz w:val="20"/>
+                <w:szCs w:val="20"/>
+              </w:rPr>
+              <w:t>—</w:t>
+            </w:r>
+          </w:p>
+        </w:tc>
+        <w:tc>
+          <w:tcPr>
+            <w:tcW w:w="0" w:type="auto"/>
+            <w:hideMark/>
+          </w:tcPr>
+          <w:p>
+            <w:pPr>
+              <w:spacing w:after="160"/>
+              <w:rPr>
+                <w:sz w:val="20"/>
+                <w:szCs w:val="20"/>
+              </w:rPr>
+            </w:pPr>
+            <w:r>
+              <w:rPr>
+                <w:sz w:val="20"/>
+                <w:szCs w:val="20"/>
+              </w:rPr>
+              <w:t>nt</w:t>
+            </w:r>
+          </w:p>
+        </w:tc>
+      </w:tr>
+      <w:tr>
+        <w:tc>
+          <w:tcPr>
+            <w:tcW w:w="0" w:type="auto"/>
+            <w:hideMark/>
+          </w:tcPr>
+          <w:p>
+            <w:pPr>
+              <w:spacing w:after="160"/>
+              <w:rPr>
+                <w:sz w:val="20"/>
+                <w:szCs w:val="20"/>
+              </w:rPr>
+            </w:pPr>
+            <w:r>
+              <w:rPr>
+                <w:sz w:val="20"/>
+                <w:szCs w:val="20"/>
+              </w:rPr>
+              <w:t>20.2</w:t>
+            </w:r>
+          </w:p>
+        </w:tc>
+        <w:tc>
+          <w:tcPr>
+            <w:tcW w:w="0" w:type="auto"/>
+            <w:hideMark/>
+          </w:tcPr>
+          <w:p>
+            <w:pPr>
+              <w:spacing w:after="160"/>
+              <w:rPr>
+                <w:sz w:val="20"/>
+                <w:szCs w:val="20"/>
+              </w:rPr>
+            </w:pPr>
+            <w:r>
+              <w:rPr>
+                <w:sz w:val="20"/>
+                <w:szCs w:val="20"/>
+              </w:rPr>
+              <w:t>Đối soát, đối chiếu số tiền COD</w:t>
+            </w:r>
+          </w:p>
+        </w:tc>
+        <w:tc>
+          <w:tcPr>
+            <w:tcW w:w="0" w:type="auto"/>
+            <w:hideMark/>
+          </w:tcPr>
+          <w:p>
+            <w:pPr>
+              <w:spacing w:after="160"/>
+              <w:rPr>
+                <w:sz w:val="20"/>
+                <w:szCs w:val="20"/>
+              </w:rPr>
+            </w:pPr>
+            <w:r>
+              <w:rPr>
+                <w:sz w:val="20"/>
+                <w:szCs w:val="20"/>
+              </w:rPr>
+              <w:t>Kế toán/Đối soát</w:t>
+            </w:r>
+          </w:p>
+        </w:tc>
+        <w:tc>
+          <w:tcPr>
+            <w:tcW w:w="0" w:type="auto"/>
+            <w:hideMark/>
+          </w:tcPr>
+          <w:p>
+            <w:pPr>
+              <w:spacing w:after="160"/>
+              <w:rPr>
+                <w:sz w:val="20"/>
+                <w:szCs w:val="20"/>
+              </w:rPr>
+            </w:pPr>
+            <w:r>
+              <w:rPr>
+                <w:sz w:val="20"/>
+                <w:szCs w:val="20"/>
+              </w:rPr>
+              <w:t>5'</w:t>
+            </w:r>
+          </w:p>
+        </w:tc>
+        <w:tc>
+          <w:tcPr>
+            <w:tcW w:w="0" w:type="auto"/>
+            <w:hideMark/>
+          </w:tcPr>
+          <w:p>
+            <w:pPr>
+              <w:spacing w:after="160"/>
+              <w:rPr>
+                <w:sz w:val="20"/>
+                <w:szCs w:val="20"/>
+              </w:rPr>
+            </w:pPr>
+            <w:r>
+              <w:rPr>
+                <w:sz w:val="20"/>
+                <w:szCs w:val="20"/>
+              </w:rPr>
+              <w:t>—</w:t>
+            </w:r>
+          </w:p>
+        </w:tc>
+        <w:tc>
+          <w:tcPr>
+            <w:tcW w:w="0" w:type="auto"/>
+            <w:hideMark/>
+          </w:tcPr>
+          <w:p>
+            <w:pPr>
+              <w:spacing w:after="160"/>
+              <w:rPr>
+                <w:sz w:val="20"/>
+                <w:szCs w:val="20"/>
+              </w:rPr>
+            </w:pPr>
+            <w:r>
+              <w:rPr>
+                <w:sz w:val="20"/>
+                <w:szCs w:val="20"/>
+              </w:rPr>
+              <w:t>nt</w:t>
+            </w:r>
+          </w:p>
+        </w:tc>
+      </w:tr>
+      <w:tr>
+        <w:tc>
+          <w:tcPr>
+            <w:tcW w:w="0" w:type="auto"/>
+            <w:hideMark/>
+          </w:tcPr>
+          <w:p>
+            <w:pPr>
+              <w:spacing w:after="160"/>
+              <w:rPr>
+                <w:sz w:val="20"/>
+                <w:szCs w:val="20"/>
+              </w:rPr>
+            </w:pPr>
+            <w:r>
+              <w:rPr>
+                <w:sz w:val="20"/>
+                <w:szCs w:val="20"/>
+              </w:rPr>
+              <w:t>20.3</w:t>
+            </w:r>
+          </w:p>
+        </w:tc>
+        <w:tc>
+          <w:tcPr>
+            <w:tcW w:w="0" w:type="auto"/>
+            <w:hideMark/>
+          </w:tcPr>
+          <w:p>
+            <w:pPr>
+              <w:spacing w:after="160"/>
+              <w:rPr>
+                <w:sz w:val="20"/>
+                <w:szCs w:val="20"/>
+              </w:rPr>
+            </w:pPr>
+            <w:r>
+              <w:rPr>
+                <w:sz w:val="20"/>
+                <w:szCs w:val="20"/>
+              </w:rPr>
+              <w:t>Theo dõi, xử lý vấn đề thanh toán</w:t>
+            </w:r>
+          </w:p>
+        </w:tc>
+        <w:tc>
+          <w:tcPr>
+            <w:tcW w:w="0" w:type="auto"/>
+            <w:hideMark/>
+          </w:tcPr>
+          <w:p>
+            <w:pPr>
+              <w:spacing w:after="160"/>
+              <w:rPr>
+                <w:sz w:val="20"/>
+                <w:szCs w:val="20"/>
+              </w:rPr>
+            </w:pPr>
+            <w:r>
+              <w:rPr>
+                <w:sz w:val="20"/>
+                <w:szCs w:val="20"/>
+              </w:rPr>
+              <w:t>Kế toán/Đối soát</w:t>
+            </w:r>
+          </w:p>
+        </w:tc>
+        <w:tc>
+          <w:tcPr>
+            <w:tcW w:w="0" w:type="auto"/>
+            <w:hideMark/>
+          </w:tcPr>
+          <w:p>
+            <w:pPr>
+              <w:spacing w:after="160"/>
+              <w:rPr>
+                <w:sz w:val="20"/>
+                <w:szCs w:val="20"/>
+              </w:rPr>
+            </w:pPr>
+            <w:r>
+              <w:rPr>
+                <w:sz w:val="20"/>
+                <w:szCs w:val="20"/>
+              </w:rPr>
+              <w:t>4'</w:t>
+            </w:r>
+          </w:p>
+        </w:tc>
+        <w:tc>
+          <w:tcPr>
+            <w:tcW w:w="0" w:type="auto"/>
+            <w:hideMark/>
+          </w:tcPr>
+          <w:p>
+            <w:pPr>
+              <w:spacing w:after="160"/>
+              <w:rPr>
+                <w:sz w:val="20"/>
+                <w:szCs w:val="20"/>
+              </w:rPr>
+            </w:pPr>
+            <w:r>
+              <w:rPr>
+                <w:sz w:val="20"/>
+                <w:szCs w:val="20"/>
+              </w:rPr>
+              <w:t>—</w:t>
+            </w:r>
+          </w:p>
+        </w:tc>
+        <w:tc>
+          <w:tcPr>
+            <w:tcW w:w="0" w:type="auto"/>
+            <w:hideMark/>
+          </w:tcPr>
+          <w:p>
+            <w:pPr>
+              <w:spacing w:after="160"/>
+              <w:rPr>
+                <w:sz w:val="20"/>
+                <w:szCs w:val="20"/>
+              </w:rPr>
+            </w:pPr>
+            <w:r>
+              <w:rPr>
+                <w:sz w:val="20"/>
+                <w:szCs w:val="20"/>
+              </w:rPr>
+              <w:t>nt</w:t>
+            </w:r>
+          </w:p>
+        </w:tc>
+      </w:tr>
+      <w:tr>
+        <w:tc>
+          <w:tcPr>
+            <w:tcW w:w="0" w:type="auto"/>
+            <w:hideMark/>
+          </w:tcPr>
+          <w:p>
+            <w:pPr>
+              <w:spacing w:after="160"/>
+              <w:rPr>
+                <w:sz w:val="20"/>
+                <w:szCs w:val="20"/>
+              </w:rPr>
+            </w:pPr>
+            <w:r>
+              <w:rPr>
+                <w:sz w:val="20"/>
+                <w:szCs w:val="20"/>
+              </w:rPr>
+              <w:t>21</w:t>
+            </w:r>
+          </w:p>
+        </w:tc>
+        <w:tc>
+          <w:tcPr>
+            <w:tcW w:w="0" w:type="auto"/>
+            <w:hideMark/>
+          </w:tcPr>
+          <w:p>
+            <w:pPr>
+              <w:spacing w:after="160"/>
+              <w:rPr>
+                <w:sz w:val="20"/>
+                <w:szCs w:val="20"/>
+              </w:rPr>
+            </w:pPr>
+            <w:r>
+              <w:rPr>
+                <w:sz w:val="20"/>
+                <w:szCs w:val="20"/>
+              </w:rPr>
+              <w:t>Xác nhận số tiền, cập nhật lên Viettel Post</w:t>
+            </w:r>
+          </w:p>
+        </w:tc>
+        <w:tc>
+          <w:tcPr>
+            <w:tcW w:w="0" w:type="auto"/>
+            <w:hideMark/>
+          </w:tcPr>
+          <w:p>
+            <w:pPr>
+              <w:spacing w:after="160"/>
+              <w:rPr>
+                <w:sz w:val="20"/>
+                <w:szCs w:val="20"/>
+              </w:rPr>
+            </w:pPr>
+            <w:r>
+              <w:rPr>
+                <w:sz w:val="20"/>
+                <w:szCs w:val="20"/>
+              </w:rPr>
+              <w:t>Kế toán</w:t>
+            </w:r>
+          </w:p>
+        </w:tc>
+        <w:tc>
+          <w:tcPr>
+            <w:tcW w:w="0" w:type="auto"/>
+            <w:hideMark/>
+          </w:tcPr>
+          <w:p>
+            <w:pPr>
+              <w:spacing w:after="160"/>
+              <w:rPr>
+                <w:sz w:val="20"/>
+                <w:szCs w:val="20"/>
+              </w:rPr>
+            </w:pPr>
+            <w:r>
+              <w:rPr>
+                <w:sz w:val="20"/>
+                <w:szCs w:val="20"/>
+              </w:rPr>
+              <w:t>5'</w:t>
+            </w:r>
+          </w:p>
+        </w:tc>
+        <w:tc>
+          <w:tcPr>
+            <w:tcW w:w="0" w:type="auto"/>
+            <w:hideMark/>
+          </w:tcPr>
+          <w:p>
+            <w:pPr>
+              <w:spacing w:after="160"/>
+              <w:rPr>
+                <w:sz w:val="20"/>
+                <w:szCs w:val="20"/>
+              </w:rPr>
+            </w:pPr>
+            <w:r>
+              <w:rPr>
+                <w:b/>
+                <w:bCs/>
+                <w:sz w:val="20"/>
+                <w:szCs w:val="20"/>
+              </w:rPr>
+              <w:t>24h</w:t>
+            </w:r>
+            <w:r>
+              <w:rPr>
+                <w:sz w:val="20"/>
+                <w:szCs w:val="20"/>
+              </w:rPr>
+              <w:t xml:space="preserve"> (cơ sở)</w:t>
+            </w:r>
+          </w:p>
+        </w:tc>
+        <w:tc>
+          <w:tcPr>
+            <w:tcW w:w="0" w:type="auto"/>
+            <w:hideMark/>
+          </w:tcPr>
+          <w:p>
+            <w:pPr>
+              <w:spacing w:after="160"/>
+              <w:rPr>
+                <w:sz w:val="20"/>
+                <w:szCs w:val="20"/>
+              </w:rPr>
+            </w:pPr>
+            <w:r>
+              <w:rPr>
+                <w:sz w:val="20"/>
+                <w:szCs w:val="20"/>
+              </w:rPr>
+              <w:t>Chờ kỳ đối soát cố định (3 lần/tuần). Nếu lệch số liệu (~5%): +&gt;72h (→ nhánh bước 24)</w:t>
+            </w:r>
+          </w:p>
+        </w:tc>
+      </w:tr>
+      <w:tr>
+        <w:tc>
+          <w:tcPr>
+            <w:tcW w:w="0" w:type="auto"/>
+            <w:hideMark/>
+          </w:tcPr>
+          <w:p>
+            <w:pPr>
+              <w:spacing w:after="160"/>
+              <w:rPr>
+                <w:sz w:val="20"/>
+                <w:szCs w:val="20"/>
+              </w:rPr>
+            </w:pPr>
+            <w:r>
+              <w:rPr>
+                <w:sz w:val="20"/>
+                <w:szCs w:val="20"/>
+              </w:rPr>
+              <w:t>22</w:t>
+            </w:r>
+          </w:p>
+        </w:tc>
+        <w:tc>
+          <w:tcPr>
+            <w:tcW w:w="0" w:type="auto"/>
+            <w:hideMark/>
+          </w:tcPr>
+          <w:p>
+            <w:pPr>
+              <w:spacing w:after="160"/>
+              <w:rPr>
+                <w:sz w:val="20"/>
+                <w:szCs w:val="20"/>
+              </w:rPr>
+            </w:pPr>
+            <w:r>
+              <w:rPr>
+                <w:sz w:val="20"/>
+                <w:szCs w:val="20"/>
+              </w:rPr>
+              <w:t>Xác nhận thông tin đơn hàng</w:t>
+            </w:r>
+          </w:p>
+        </w:tc>
+        <w:tc>
+          <w:tcPr>
+            <w:tcW w:w="0" w:type="auto"/>
+            <w:hideMark/>
+          </w:tcPr>
+          <w:p>
+            <w:pPr>
+              <w:spacing w:after="160"/>
+              <w:rPr>
+                <w:sz w:val="20"/>
+                <w:szCs w:val="20"/>
+              </w:rPr>
+            </w:pPr>
+            <w:r>
+              <w:rPr>
+                <w:sz w:val="20"/>
+                <w:szCs w:val="20"/>
+              </w:rPr>
+              <w:t>Bưu cục</w:t>
+            </w:r>
+          </w:p>
+        </w:tc>
+        <w:tc>
+          <w:tcPr>
+            <w:tcW w:w="0" w:type="auto"/>
+            <w:hideMark/>
+          </w:tcPr>
+          <w:p>
+            <w:pPr>
+              <w:spacing w:after="160"/>
+              <w:rPr>
+                <w:sz w:val="20"/>
+                <w:szCs w:val="20"/>
+              </w:rPr>
+            </w:pPr>
+            <w:r>
+              <w:rPr>
+                <w:sz w:val="20"/>
+                <w:szCs w:val="20"/>
+              </w:rPr>
+              <w:t>1'</w:t>
+            </w:r>
+          </w:p>
+        </w:tc>
+        <w:tc>
+          <w:tcPr>
+            <w:tcW w:w="0" w:type="auto"/>
+            <w:hideMark/>
+          </w:tcPr>
+          <w:p>
+            <w:pPr>
+              <w:spacing w:after="160"/>
+              <w:rPr>
+                <w:sz w:val="20"/>
+                <w:szCs w:val="20"/>
+              </w:rPr>
+            </w:pPr>
+            <w:r>
+              <w:rPr>
+                <w:b/>
+                <w:bCs/>
+                <w:sz w:val="20"/>
+                <w:szCs w:val="20"/>
+              </w:rPr>
+              <w:t>24h</w:t>
+            </w:r>
+          </w:p>
+        </w:tc>
+        <w:tc>
+          <w:tcPr>
+            <w:tcW w:w="0" w:type="auto"/>
+            <w:hideMark/>
+          </w:tcPr>
+          <w:p>
+            <w:pPr>
+              <w:spacing w:after="160"/>
+              <w:rPr>
+                <w:sz w:val="20"/>
+                <w:szCs w:val="20"/>
+              </w:rPr>
+            </w:pPr>
+            <w:r>
+              <w:rPr>
+                <w:sz w:val="20"/>
+                <w:szCs w:val="20"/>
+              </w:rPr>
+              <w:t xml:space="preserve">WT ngân hàng xử lý chuyển khoản </w:t>
+            </w:r>
+            <w:r>
+              <w:rPr>
+                <w:i/>
+                <w:iCs/>
+                <w:sz w:val="20"/>
+                <w:szCs w:val="20"/>
+              </w:rPr>
+              <w:t>(ước tính, cần xác nhận vận hành)</w:t>
+            </w:r>
+          </w:p>
+        </w:tc>
+      </w:tr>
+      <w:tr>
+        <w:tc>
+          <w:tcPr>
+            <w:tcW w:w="0" w:type="auto"/>
+            <w:hideMark/>
+          </w:tcPr>
+          <w:p>
+            <w:pPr>
+              <w:spacing w:after="160"/>
+              <w:rPr>
+                <w:sz w:val="20"/>
+                <w:szCs w:val="20"/>
+              </w:rPr>
+            </w:pPr>
+            <w:r>
+              <w:rPr>
+                <w:sz w:val="20"/>
+                <w:szCs w:val="20"/>
+              </w:rPr>
+              <w:t>23</w:t>
+            </w:r>
+          </w:p>
+        </w:tc>
+        <w:tc>
+          <w:tcPr>
+            <w:tcW w:w="0" w:type="auto"/>
+            <w:hideMark/>
+          </w:tcPr>
+          <w:p>
+            <w:pPr>
+              <w:spacing w:after="160"/>
+              <w:rPr>
+                <w:sz w:val="20"/>
+                <w:szCs w:val="20"/>
+              </w:rPr>
+            </w:pPr>
+            <w:r>
+              <w:rPr>
+                <w:sz w:val="20"/>
+                <w:szCs w:val="20"/>
+              </w:rPr>
+              <w:t>Xác nhận thông tin đơn hàng (End Event)</w:t>
+            </w:r>
+          </w:p>
+        </w:tc>
+        <w:tc>
+          <w:tcPr>
+            <w:tcW w:w="0" w:type="auto"/>
+            <w:hideMark/>
+          </w:tcPr>
+          <w:p>
+            <w:pPr>
+              <w:spacing w:after="160"/>
+              <w:rPr>
+                <w:sz w:val="20"/>
+                <w:szCs w:val="20"/>
+              </w:rPr>
+            </w:pPr>
+            <w:r>
+              <w:rPr>
+                <w:sz w:val="20"/>
+                <w:szCs w:val="20"/>
+              </w:rPr>
+              <w:t>Người gửi</w:t>
+            </w:r>
+          </w:p>
+        </w:tc>
+        <w:tc>
+          <w:tcPr>
+            <w:tcW w:w="0" w:type="auto"/>
+            <w:hideMark/>
+          </w:tcPr>
+          <w:p>
+            <w:pPr>
+              <w:spacing w:after="160"/>
+              <w:rPr>
+                <w:sz w:val="20"/>
+                <w:szCs w:val="20"/>
+              </w:rPr>
+            </w:pPr>
+            <w:r>
+              <w:rPr>
+                <w:sz w:val="20"/>
+                <w:szCs w:val="20"/>
+              </w:rPr>
+              <w:t>1'</w:t>
+            </w:r>
+          </w:p>
+        </w:tc>
+        <w:tc>
+          <w:tcPr>
+            <w:tcW w:w="0" w:type="auto"/>
+            <w:hideMark/>
+          </w:tcPr>
+          <w:p>
+            <w:pPr>
+              <w:spacing w:after="160"/>
+              <w:rPr>
+                <w:sz w:val="20"/>
+                <w:szCs w:val="20"/>
+              </w:rPr>
+            </w:pPr>
+            <w:r>
+              <w:rPr>
+                <w:sz w:val="20"/>
+                <w:szCs w:val="20"/>
+              </w:rPr>
+              <w:t>0</w:t>
+            </w:r>
+          </w:p>
+        </w:tc>
+        <w:tc>
+          <w:tcPr>
+            <w:tcW w:w="0" w:type="auto"/>
+            <w:hideMark/>
+          </w:tcPr>
+          <w:p>
+            <w:pPr>
+              <w:spacing w:after="160"/>
+              <w:rPr>
+                <w:sz w:val="20"/>
+                <w:szCs w:val="20"/>
+              </w:rPr>
+            </w:pPr>
+            <w:r>
+              <w:rPr>
+                <w:sz w:val="20"/>
+                <w:szCs w:val="20"/>
+              </w:rPr>
+              <w:t>Thông báo hoàn tất tự động</w:t>
+            </w:r>
+          </w:p>
+        </w:tc>
+      </w:tr>
+      <w:tr>
+        <w:tc>
+          <w:tcPr>
+            <w:tcW w:w="0" w:type="auto"/>
+            <w:hideMark/>
+          </w:tcPr>
+          <w:p>
+            <w:pPr>
+              <w:spacing w:after="160"/>
+              <w:rPr>
+                <w:sz w:val="20"/>
+                <w:szCs w:val="20"/>
+              </w:rPr>
+            </w:pPr>
+            <w:r>
+              <w:rPr>
+                <w:sz w:val="20"/>
+                <w:szCs w:val="20"/>
+              </w:rPr>
+              <w:t>24</w:t>
+            </w:r>
+          </w:p>
+        </w:tc>
+        <w:tc>
+          <w:tcPr>
+            <w:tcW w:w="0" w:type="auto"/>
+            <w:hideMark/>
+          </w:tcPr>
+          <w:p>
+            <w:pPr>
+              <w:spacing w:after="160"/>
+              <w:rPr>
+                <w:sz w:val="20"/>
+                <w:szCs w:val="20"/>
+              </w:rPr>
+            </w:pPr>
+            <w:r>
+              <w:rPr>
+                <w:sz w:val="20"/>
+                <w:szCs w:val="20"/>
+              </w:rPr>
+              <w:t>Theo dõi, xử lý khiếu nại đối soát</w:t>
+            </w:r>
+          </w:p>
+        </w:tc>
+        <w:tc>
+          <w:tcPr>
+            <w:tcW w:w="0" w:type="auto"/>
+            <w:hideMark/>
+          </w:tcPr>
+          <w:p>
+            <w:pPr>
+              <w:spacing w:after="160"/>
+              <w:rPr>
+                <w:sz w:val="20"/>
+                <w:szCs w:val="20"/>
+              </w:rPr>
+            </w:pPr>
+            <w:r>
+              <w:rPr>
+                <w:sz w:val="20"/>
+                <w:szCs w:val="20"/>
+              </w:rPr>
+              <w:t>Bộ phận CSKH</w:t>
+            </w:r>
+          </w:p>
+        </w:tc>
+        <w:tc>
+          <w:tcPr>
+            <w:tcW w:w="0" w:type="auto"/>
+            <w:hideMark/>
+          </w:tcPr>
+          <w:p>
+            <w:pPr>
+              <w:spacing w:after="160"/>
+              <w:rPr>
+                <w:sz w:val="20"/>
+                <w:szCs w:val="20"/>
+              </w:rPr>
+            </w:pPr>
+            <w:r>
+              <w:rPr>
+                <w:sz w:val="20"/>
+                <w:szCs w:val="20"/>
+              </w:rPr>
+              <w:t>15' (0,75' kỳ vọng)</w:t>
+            </w:r>
+          </w:p>
+        </w:tc>
+        <w:tc>
+          <w:tcPr>
+            <w:tcW w:w="0" w:type="auto"/>
+            <w:hideMark/>
+          </w:tcPr>
+          <w:p>
+            <w:pPr>
+              <w:spacing w:after="160"/>
+              <w:rPr>
+                <w:sz w:val="20"/>
+                <w:szCs w:val="20"/>
+              </w:rPr>
+            </w:pPr>
+            <w:r>
+              <w:rPr>
+                <w:b/>
+                <w:bCs/>
+                <w:sz w:val="20"/>
+                <w:szCs w:val="20"/>
+              </w:rPr>
+              <w:t>72h</w:t>
+            </w:r>
+            <w:r>
+              <w:rPr>
+                <w:sz w:val="20"/>
+                <w:szCs w:val="20"/>
+              </w:rPr>
+              <w:t xml:space="preserve"> (nhánh ~5%)</w:t>
+            </w:r>
+          </w:p>
+        </w:tc>
+        <w:tc>
+          <w:tcPr>
+            <w:tcW w:w="0" w:type="auto"/>
+            <w:hideMark/>
+          </w:tcPr>
+          <w:p>
+            <w:pPr>
+              <w:spacing w:after="160"/>
+              <w:rPr>
+                <w:sz w:val="20"/>
+                <w:szCs w:val="20"/>
+              </w:rPr>
+            </w:pPr>
+            <w:r>
+              <w:rPr>
+                <w:sz w:val="20"/>
+                <w:szCs w:val="20"/>
+              </w:rPr>
+              <w:t>PT kỳ vọng = 15'×5% xác suất phát sinh</w:t>
+            </w:r>
+          </w:p>
+        </w:tc>
+      </w:tr>
+    </w:tbl>
+    <w:p>
+      <w:pPr>
+        <w:spacing w:after="220"/>
+        <w:jc w:val="center"/>
+        <w:rPr>
+          <w:i/>
+          <w:iCs/>
+        </w:rPr>
+      </w:pPr>
+    </w:p>
+    <w:p>
+      <w:pPr>
+        <w:spacing w:after="220"/>
+        <w:jc w:val="center"/>
+        <w:rPr>
+          <w:i/>
+          <w:iCs/>
+        </w:rPr>
+      </w:pPr>
+      <w:r>
+        <w:rPr>
+          <w:i/>
+          <w:iCs/>
+          <w:noProof/>
+        </w:rPr>
+        <w:drawing>
+          <wp:inline distT="0" distB="0" distL="0" distR="0" wp14:anchorId="08649505" wp14:editId="69205D23">
+            <wp:extent cx="5720080" cy="2594610"/>
+            <wp:effectExtent l="0" t="0" r="0" b="0"/>
+            <wp:docPr id="572027950" name="Picture 2"/>
+            <wp:cNvGraphicFramePr>
+              <a:graphicFrameLocks xmlns:a="http://schemas.openxmlformats.org/drawingml/2006/main" noChangeAspect="1"/>
+            </wp:cNvGraphicFramePr>
+            <a:graphic xmlns:a="http://schemas.openxmlformats.org/drawingml/2006/main">
+              <a:graphicData uri="http://schemas.openxmlformats.org/drawingml/2006/picture">
+                <pic:pic xmlns:pic="http://schemas.openxmlformats.org/drawingml/2006/picture">
+                  <pic:nvPicPr>
+                    <pic:cNvPr id="0" name="Picture 1"/>
+                    <pic:cNvPicPr>
+                      <a:picLocks noChangeAspect="1" noChangeArrowheads="1"/>
+                    </pic:cNvPicPr>
+                  </pic:nvPicPr>
+                  <pic:blipFill>
+                    <a:blip r:embed="rId15" cstate="print">
+                      <a:extLst>
+                        <a:ext uri="{28A0092B-C50C-407E-A947-70E740481C1C}">
+                          <a14:useLocalDpi xmlns:a14="http://schemas.microsoft.com/office/drawing/2010/main" val="0"/>
+                        </a:ext>
+                      </a:extLst>
+                    </a:blip>
+                    <a:srcRect/>
+                    <a:stretch>
+                      <a:fillRect/>
+                    </a:stretch>
+                  </pic:blipFill>
+                  <pic:spPr bwMode="auto">
+                    <a:xfrm>
+                      <a:off x="0" y="0"/>
+                      <a:ext cx="5720080" cy="2594610"/>
+                    </a:xfrm>
+                    <a:prstGeom prst="rect">
+                      <a:avLst/>
+                    </a:prstGeom>
+                    <a:noFill/>
+                    <a:ln>
+                      <a:noFill/>
+                    </a:ln>
+                  </pic:spPr>
+                </pic:pic>
+              </a:graphicData>
+            </a:graphic>
+          </wp:inline>
+        </w:drawing>
+      </w:r>
+    </w:p>
+    <w:p>
+      <w:pPr>
+        <w:spacing w:after="220"/>
+        <w:jc w:val="center"/>
+        <w:rPr>
+          <w:i/>
+          <w:iCs/>
+        </w:rPr>
       </w:pPr>
       <w:r>
         <w:rPr>
@@ -36045,30 +40280,39 @@
                 <w:sz w:val="18"/>
                 <w:szCs w:val="18"/>
               </w:rPr>
-              <w:t>Chi phí nhân công thao tác (happy path)</w:t>
-            </w:r>
-          </w:p>
-        </w:tc>
-        <w:tc>
-          <w:tcPr>
-            <w:tcW w:w="0" w:type="auto"/>
-            <w:tcMar>
-              <w:top w:w="60" w:type="dxa"/>
-              <w:left w:w="100" w:type="dxa"/>
-              <w:bottom w:w="60" w:type="dxa"/>
-              <w:right w:w="100" w:type="dxa"/>
-            </w:tcMar>
-            <w:vAlign w:val="center"/>
-          </w:tcPr>
-          <w:p>
-            <w:pPr>
-              <w:jc w:val="both"/>
-            </w:pPr>
-            <w:r>
-              <w:rPr>
-                <w:sz w:val="18"/>
-                <w:szCs w:val="18"/>
-              </w:rPr>
+              <w:t xml:space="preserve">Chi phí nhân công thao tác </w:t>
+            </w:r>
+            <w:r>
+              <w:rPr>
+                <w:sz w:val="18"/>
+                <w:szCs w:val="18"/>
+              </w:rPr>
+              <w:lastRenderedPageBreak/>
+              <w:t>(happy path)</w:t>
+            </w:r>
+          </w:p>
+        </w:tc>
+        <w:tc>
+          <w:tcPr>
+            <w:tcW w:w="0" w:type="auto"/>
+            <w:tcMar>
+              <w:top w:w="60" w:type="dxa"/>
+              <w:left w:w="100" w:type="dxa"/>
+              <w:bottom w:w="60" w:type="dxa"/>
+              <w:right w:w="100" w:type="dxa"/>
+            </w:tcMar>
+            <w:vAlign w:val="center"/>
+          </w:tcPr>
+          <w:p>
+            <w:pPr>
+              <w:jc w:val="both"/>
+            </w:pPr>
+            <w:r>
+              <w:rPr>
+                <w:sz w:val="18"/>
+                <w:szCs w:val="18"/>
+              </w:rPr>
+              <w:lastRenderedPageBreak/>
               <w:t>Tổng PT (giờ) × đơn giá nhân công giả định (60.000đ/giờ)</w:t>
             </w:r>
           </w:p>
@@ -36141,31 +40385,48 @@
                 <w:sz w:val="18"/>
                 <w:szCs w:val="18"/>
               </w:rPr>
-              <w:t>Chi phí nhân công trực tiếp thấp; tổng 0,24 giờ khớp đúng dòng PT tổng tại Bảng 20</w:t>
-            </w:r>
-          </w:p>
-        </w:tc>
-        <w:tc>
-          <w:tcPr>
-            <w:tcW w:w="0" w:type="auto"/>
-            <w:tcMar>
-              <w:top w:w="60" w:type="dxa"/>
-              <w:left w:w="100" w:type="dxa"/>
-              <w:bottom w:w="60" w:type="dxa"/>
-              <w:right w:w="100" w:type="dxa"/>
-            </w:tcMar>
-            <w:vAlign w:val="center"/>
-          </w:tcPr>
-          <w:p>
-            <w:pPr>
-              <w:jc w:val="both"/>
-            </w:pPr>
-            <w:r>
-              <w:rPr>
-                <w:sz w:val="18"/>
-                <w:szCs w:val="18"/>
-              </w:rPr>
-              <w:t>Tự động hóa các bước PT thủ công (B2, B5, B6) để giảm thêm chi phí nhân công</w:t>
+              <w:t xml:space="preserve">Chi phí nhân công trực tiếp thấp; tổng 0,24 giờ khớp đúng </w:t>
+            </w:r>
+            <w:r>
+              <w:rPr>
+                <w:sz w:val="18"/>
+                <w:szCs w:val="18"/>
+              </w:rPr>
+              <w:lastRenderedPageBreak/>
+              <w:t>dòng PT tổng tại Bảng 20</w:t>
+            </w:r>
+          </w:p>
+        </w:tc>
+        <w:tc>
+          <w:tcPr>
+            <w:tcW w:w="0" w:type="auto"/>
+            <w:tcMar>
+              <w:top w:w="60" w:type="dxa"/>
+              <w:left w:w="100" w:type="dxa"/>
+              <w:bottom w:w="60" w:type="dxa"/>
+              <w:right w:w="100" w:type="dxa"/>
+            </w:tcMar>
+            <w:vAlign w:val="center"/>
+          </w:tcPr>
+          <w:p>
+            <w:pPr>
+              <w:jc w:val="both"/>
+            </w:pPr>
+            <w:r>
+              <w:rPr>
+                <w:sz w:val="18"/>
+                <w:szCs w:val="18"/>
+              </w:rPr>
+              <w:lastRenderedPageBreak/>
+              <w:t xml:space="preserve">Tự động hóa các bước PT thủ công (B2, B5, B6) để giảm </w:t>
+            </w:r>
+            <w:r>
+              <w:rPr>
+                <w:sz w:val="18"/>
+                <w:szCs w:val="18"/>
+              </w:rPr>
+              <w:lastRenderedPageBreak/>
+              <w:t>thêm chi phí nhân công</w:t>
             </w:r>
           </w:p>
         </w:tc>
@@ -36191,6 +40452,7 @@
                 <w:sz w:val="18"/>
                 <w:szCs w:val="18"/>
               </w:rPr>
+              <w:lastRenderedPageBreak/>
               <w:t>Phí thu hộ COD thu từ khách hàng</w:t>
             </w:r>
           </w:p>
@@ -36483,7 +40745,6 @@
                 <w:sz w:val="18"/>
                 <w:szCs w:val="18"/>
               </w:rPr>
-              <w:lastRenderedPageBreak/>
               <w:t>Chi phí xử lý khiếu nại (Over-Do)</w:t>
             </w:r>
           </w:p>
@@ -36750,11 +41011,6 @@
         </w:rPr>
         <w:t>Ghi chú: Các nguồn trên đã được mở lại và xác nhận còn tồn tại tại thời điểm biên soạn (tháng 8/2026). Các mã phụ lục PL-07 đến PL-12 (biên bản phỏng vấn giả lập và các hình minh họa tự dựng) không có URL vì là sản phẩm nội bộ của nhóm thực hiện, cần thay thế bằng minh chứng thực tế trước khi sử dụng chính thức.</w:t>
       </w:r>
-    </w:p>
-    <w:p>
-      <w:pPr>
-        <w:spacing w:after="160"/>
-      </w:pPr>
     </w:p>
     <w:sectPr>
       <w:pgSz w:w="11906" w:h="16838"/>
@@ -38393,6 +42649,155 @@
     </w:lvl>
   </w:abstractNum>
   <w:abstractNum w:abstractNumId="18" w15:restartNumberingAfterBreak="0">
+    <w:nsid w:val="67FE36CD"/>
+    <w:multiLevelType w:val="multilevel"/>
+    <w:tmpl w:val="0E8C908A"/>
+    <w:lvl w:ilvl="0">
+      <w:start w:val="1"/>
+      <w:numFmt w:val="bullet"/>
+      <w:lvlText w:val=""/>
+      <w:lvlJc w:val="left"/>
+      <w:pPr>
+        <w:tabs>
+          <w:tab w:val="num" w:pos="720"/>
+        </w:tabs>
+        <w:ind w:left="720" w:hanging="360"/>
+      </w:pPr>
+      <w:rPr>
+        <w:rFonts w:ascii="Symbol" w:hAnsi="Symbol" w:hint="default"/>
+        <w:sz w:val="20"/>
+      </w:rPr>
+    </w:lvl>
+    <w:lvl w:ilvl="1" w:tentative="1">
+      <w:start w:val="1"/>
+      <w:numFmt w:val="bullet"/>
+      <w:lvlText w:val="o"/>
+      <w:lvlJc w:val="left"/>
+      <w:pPr>
+        <w:tabs>
+          <w:tab w:val="num" w:pos="1440"/>
+        </w:tabs>
+        <w:ind w:left="1440" w:hanging="360"/>
+      </w:pPr>
+      <w:rPr>
+        <w:rFonts w:ascii="Courier New" w:hAnsi="Courier New" w:hint="default"/>
+        <w:sz w:val="20"/>
+      </w:rPr>
+    </w:lvl>
+    <w:lvl w:ilvl="2" w:tentative="1">
+      <w:start w:val="1"/>
+      <w:numFmt w:val="bullet"/>
+      <w:lvlText w:val=""/>
+      <w:lvlJc w:val="left"/>
+      <w:pPr>
+        <w:tabs>
+          <w:tab w:val="num" w:pos="2160"/>
+        </w:tabs>
+        <w:ind w:left="2160" w:hanging="360"/>
+      </w:pPr>
+      <w:rPr>
+        <w:rFonts w:ascii="Wingdings" w:hAnsi="Wingdings" w:hint="default"/>
+        <w:sz w:val="20"/>
+      </w:rPr>
+    </w:lvl>
+    <w:lvl w:ilvl="3" w:tentative="1">
+      <w:start w:val="1"/>
+      <w:numFmt w:val="bullet"/>
+      <w:lvlText w:val=""/>
+      <w:lvlJc w:val="left"/>
+      <w:pPr>
+        <w:tabs>
+          <w:tab w:val="num" w:pos="2880"/>
+        </w:tabs>
+        <w:ind w:left="2880" w:hanging="360"/>
+      </w:pPr>
+      <w:rPr>
+        <w:rFonts w:ascii="Wingdings" w:hAnsi="Wingdings" w:hint="default"/>
+        <w:sz w:val="20"/>
+      </w:rPr>
+    </w:lvl>
+    <w:lvl w:ilvl="4" w:tentative="1">
+      <w:start w:val="1"/>
+      <w:numFmt w:val="bullet"/>
+      <w:lvlText w:val=""/>
+      <w:lvlJc w:val="left"/>
+      <w:pPr>
+        <w:tabs>
+          <w:tab w:val="num" w:pos="3600"/>
+        </w:tabs>
+        <w:ind w:left="3600" w:hanging="360"/>
+      </w:pPr>
+      <w:rPr>
+        <w:rFonts w:ascii="Wingdings" w:hAnsi="Wingdings" w:hint="default"/>
+        <w:sz w:val="20"/>
+      </w:rPr>
+    </w:lvl>
+    <w:lvl w:ilvl="5" w:tentative="1">
+      <w:start w:val="1"/>
+      <w:numFmt w:val="bullet"/>
+      <w:lvlText w:val=""/>
+      <w:lvlJc w:val="left"/>
+      <w:pPr>
+        <w:tabs>
+          <w:tab w:val="num" w:pos="4320"/>
+        </w:tabs>
+        <w:ind w:left="4320" w:hanging="360"/>
+      </w:pPr>
+      <w:rPr>
+        <w:rFonts w:ascii="Wingdings" w:hAnsi="Wingdings" w:hint="default"/>
+        <w:sz w:val="20"/>
+      </w:rPr>
+    </w:lvl>
+    <w:lvl w:ilvl="6" w:tentative="1">
+      <w:start w:val="1"/>
+      <w:numFmt w:val="bullet"/>
+      <w:lvlText w:val=""/>
+      <w:lvlJc w:val="left"/>
+      <w:pPr>
+        <w:tabs>
+          <w:tab w:val="num" w:pos="5040"/>
+        </w:tabs>
+        <w:ind w:left="5040" w:hanging="360"/>
+      </w:pPr>
+      <w:rPr>
+        <w:rFonts w:ascii="Wingdings" w:hAnsi="Wingdings" w:hint="default"/>
+        <w:sz w:val="20"/>
+      </w:rPr>
+    </w:lvl>
+    <w:lvl w:ilvl="7" w:tentative="1">
+      <w:start w:val="1"/>
+      <w:numFmt w:val="bullet"/>
+      <w:lvlText w:val=""/>
+      <w:lvlJc w:val="left"/>
+      <w:pPr>
+        <w:tabs>
+          <w:tab w:val="num" w:pos="5760"/>
+        </w:tabs>
+        <w:ind w:left="5760" w:hanging="360"/>
+      </w:pPr>
+      <w:rPr>
+        <w:rFonts w:ascii="Wingdings" w:hAnsi="Wingdings" w:hint="default"/>
+        <w:sz w:val="20"/>
+      </w:rPr>
+    </w:lvl>
+    <w:lvl w:ilvl="8" w:tentative="1">
+      <w:start w:val="1"/>
+      <w:numFmt w:val="bullet"/>
+      <w:lvlText w:val=""/>
+      <w:lvlJc w:val="left"/>
+      <w:pPr>
+        <w:tabs>
+          <w:tab w:val="num" w:pos="6480"/>
+        </w:tabs>
+        <w:ind w:left="6480" w:hanging="360"/>
+      </w:pPr>
+      <w:rPr>
+        <w:rFonts w:ascii="Wingdings" w:hAnsi="Wingdings" w:hint="default"/>
+        <w:sz w:val="20"/>
+      </w:rPr>
+    </w:lvl>
+  </w:abstractNum>
+  <w:abstractNum w:abstractNumId="19" w15:restartNumberingAfterBreak="0">
     <w:nsid w:val="6B91596C"/>
     <w:multiLevelType w:val="hybridMultilevel"/>
     <w:tmpl w:val="A42A8332"/>
@@ -38481,7 +42886,7 @@
       </w:pPr>
     </w:lvl>
   </w:abstractNum>
-  <w:abstractNum w:abstractNumId="19" w15:restartNumberingAfterBreak="0">
+  <w:abstractNum w:abstractNumId="20" w15:restartNumberingAfterBreak="0">
     <w:nsid w:val="6D9A7752"/>
     <w:multiLevelType w:val="hybridMultilevel"/>
     <w:tmpl w:val="C11E4732"/>
@@ -38570,7 +42975,7 @@
       </w:pPr>
     </w:lvl>
   </w:abstractNum>
-  <w:abstractNum w:abstractNumId="20" w15:restartNumberingAfterBreak="0">
+  <w:abstractNum w:abstractNumId="21" w15:restartNumberingAfterBreak="0">
     <w:nsid w:val="7033212F"/>
     <w:multiLevelType w:val="hybridMultilevel"/>
     <w:tmpl w:val="B47C731C"/>
@@ -38660,7 +43065,7 @@
       </w:pPr>
     </w:lvl>
   </w:abstractNum>
-  <w:abstractNum w:abstractNumId="21" w15:restartNumberingAfterBreak="0">
+  <w:abstractNum w:abstractNumId="22" w15:restartNumberingAfterBreak="0">
     <w:nsid w:val="71ED7158"/>
     <w:multiLevelType w:val="hybridMultilevel"/>
     <w:tmpl w:val="B5C02820"/>
@@ -38749,7 +43154,7 @@
       </w:pPr>
     </w:lvl>
   </w:abstractNum>
-  <w:abstractNum w:abstractNumId="22" w15:restartNumberingAfterBreak="0">
+  <w:abstractNum w:abstractNumId="23" w15:restartNumberingAfterBreak="0">
     <w:nsid w:val="733A51D2"/>
     <w:multiLevelType w:val="hybridMultilevel"/>
     <w:tmpl w:val="7D76B538"/>
@@ -38839,7 +43244,7 @@
       </w:pPr>
     </w:lvl>
   </w:abstractNum>
-  <w:abstractNum w:abstractNumId="23" w15:restartNumberingAfterBreak="0">
+  <w:abstractNum w:abstractNumId="24" w15:restartNumberingAfterBreak="0">
     <w:nsid w:val="77CB668B"/>
     <w:multiLevelType w:val="hybridMultilevel"/>
     <w:tmpl w:val="9268423E"/>
@@ -38928,7 +43333,7 @@
       </w:pPr>
     </w:lvl>
   </w:abstractNum>
-  <w:abstractNum w:abstractNumId="24" w15:restartNumberingAfterBreak="0">
+  <w:abstractNum w:abstractNumId="25" w15:restartNumberingAfterBreak="0">
     <w:nsid w:val="780A6608"/>
     <w:multiLevelType w:val="hybridMultilevel"/>
     <w:tmpl w:val="60668C96"/>
@@ -39033,7 +43438,7 @@
     <w:abstractNumId w:val="11"/>
   </w:num>
   <w:num w:numId="4" w16cid:durableId="606694642">
-    <w:abstractNumId w:val="23"/>
+    <w:abstractNumId w:val="24"/>
   </w:num>
   <w:num w:numId="5" w16cid:durableId="941373458">
     <w:abstractNumId w:val="10"/>
@@ -39045,7 +43450,7 @@
     <w:abstractNumId w:val="3"/>
   </w:num>
   <w:num w:numId="8" w16cid:durableId="1590966324">
-    <w:abstractNumId w:val="18"/>
+    <w:abstractNumId w:val="19"/>
   </w:num>
   <w:num w:numId="9" w16cid:durableId="1261985130">
     <w:abstractNumId w:val="12"/>
@@ -39060,13 +43465,13 @@
     <w:abstractNumId w:val="14"/>
   </w:num>
   <w:num w:numId="13" w16cid:durableId="1200124337">
-    <w:abstractNumId w:val="21"/>
+    <w:abstractNumId w:val="22"/>
   </w:num>
   <w:num w:numId="14" w16cid:durableId="2107993382">
     <w:abstractNumId w:val="15"/>
   </w:num>
   <w:num w:numId="15" w16cid:durableId="30107089">
-    <w:abstractNumId w:val="19"/>
+    <w:abstractNumId w:val="20"/>
   </w:num>
   <w:num w:numId="16" w16cid:durableId="309485138">
     <w:abstractNumId w:val="6"/>
@@ -39078,7 +43483,7 @@
     <w:abstractNumId w:val="17"/>
   </w:num>
   <w:num w:numId="19" w16cid:durableId="86080170">
-    <w:abstractNumId w:val="24"/>
+    <w:abstractNumId w:val="25"/>
   </w:num>
   <w:num w:numId="20" w16cid:durableId="1554735754">
     <w:abstractNumId w:val="4"/>
@@ -39087,16 +43492,19 @@
     <w:abstractNumId w:val="9"/>
   </w:num>
   <w:num w:numId="22" w16cid:durableId="1489321442">
-    <w:abstractNumId w:val="20"/>
+    <w:abstractNumId w:val="21"/>
   </w:num>
   <w:num w:numId="23" w16cid:durableId="1014957342">
-    <w:abstractNumId w:val="22"/>
+    <w:abstractNumId w:val="23"/>
   </w:num>
   <w:num w:numId="24" w16cid:durableId="331420471">
     <w:abstractNumId w:val="1"/>
   </w:num>
   <w:num w:numId="25" w16cid:durableId="187841321">
     <w:abstractNumId w:val="5"/>
+  </w:num>
+  <w:num w:numId="26" w16cid:durableId="1397439821">
+    <w:abstractNumId w:val="18"/>
   </w:num>
 </w:numbering>
 </file>
@@ -39581,7 +43989,6 @@
   <w:style w:type="character" w:default="1" w:styleId="DefaultParagraphFont">
     <w:name w:val="Default Paragraph Font"/>
     <w:uiPriority w:val="1"/>
-    <w:semiHidden/>
     <w:unhideWhenUsed/>
   </w:style>
   <w:style w:type="table" w:default="1" w:styleId="TableNormal">

</xml_diff>